<commit_message>
Add document set customization, service template workflow, and sim change form
Reworks document rendering (repeating tables, representative-session
handling, provider signature/stamp assets) across transfer, aftersale,
beautiful_number and prepaid_contract; adds a new sim_change_form document
type and a service_templates module that turns a CCCD scan + subscriber
number into a numbered folder of generated document JPGs. Ignores
desktop_app/data/input/, which holds real customer scans kept local-only.

Co-Authored-By: Claude Sonnet 5 <noreply@anthropic.com>
</commit_message>
<xml_diff>
--- a/desktop_app/backend/documents/aftersale/00_MAU_CAM_KET_SAU_BAN_HANG.docx
+++ b/desktop_app/backend/documents/aftersale/00_MAU_CAM_KET_SAU_BAN_HANG.docx
@@ -2,25 +2,6 @@
 <file path=word/document.xml><?xml version="1.0" encoding="utf-8"?>
 <w:document xmlns:o="urn:schemas-microsoft-com:office:office" xmlns:r="http://schemas.openxmlformats.org/officeDocument/2006/relationships" xmlns:v="urn:schemas-microsoft-com:vml" xmlns:w="http://schemas.openxmlformats.org/wordprocessingml/2006/main" xmlns:w10="urn:schemas-microsoft-com:office:word" xmlns:wp="http://schemas.openxmlformats.org/drawingml/2006/wordprocessingDrawing" xmlns:pic="http://schemas.openxmlformats.org/drawingml/2006/picture" xmlns:wps="http://schemas.microsoft.com/office/word/2010/wordprocessingShape" xmlns:wpg="http://schemas.microsoft.com/office/word/2010/wordprocessingGroup" xmlns:mc="http://schemas.openxmlformats.org/markup-compatibility/2006" xmlns:wp14="http://schemas.microsoft.com/office/word/2010/wordprocessingDrawing" xmlns:w14="http://schemas.microsoft.com/office/word/2010/wordml" xmlns:w15="http://schemas.microsoft.com/office/word/2012/wordml" mc:Ignorable="w14 wp14 w15">
   <w:body>
-    <w:p>
-      <w:pPr>
-        <w:pStyle w:val="BodyText"/>
-        <w:spacing w:before="7" w:after="1"/>
-        <w:ind w:start="0"/>
-        <w:rPr>
-          <w:rFonts w:ascii="Times New Roman" w:hAnsi="Times New Roman"/>
-          <w:sz w:val="24"/>
-          <w:szCs w:val="24"/>
-        </w:rPr>
-      </w:pPr>
-      <w:r>
-        <w:rPr>
-          <w:rFonts w:ascii="Times New Roman" w:hAnsi="Times New Roman"/>
-          <w:sz w:val="24"/>
-          <w:szCs w:val="24"/>
-        </w:rPr>
-      </w:r>
-    </w:p>
     <w:p>
       <w:pPr>
         <w:pStyle w:val="BodyText"/>
@@ -64,9 +45,9 @@
                             <a:avLst/>
                             <a:gdLst>
                               <a:gd name="textAreaLeft" fmla="*/ 0 w 396360"/>
-                              <a:gd name="textAreaRight" fmla="*/ 399960 w 396360"/>
+                              <a:gd name="textAreaRight" fmla="*/ 401040 w 396360"/>
                               <a:gd name="textAreaTop" fmla="*/ 0 h 187200"/>
-                              <a:gd name="textAreaBottom" fmla="*/ 190800 h 187200"/>
+                              <a:gd name="textAreaBottom" fmla="*/ 191880 h 187200"/>
                             </a:gdLst>
                             <a:ahLst/>
                             <a:cxnLst/>
@@ -350,25 +331,6 @@
             </w:pict>
           </mc:Fallback>
         </mc:AlternateContent>
-      </w:r>
-    </w:p>
-    <w:p>
-      <w:pPr>
-        <w:pStyle w:val="BodyText"/>
-        <w:spacing w:before="6" w:after="0"/>
-        <w:ind w:start="0"/>
-        <w:rPr>
-          <w:rFonts w:ascii="Times New Roman" w:hAnsi="Times New Roman"/>
-          <w:sz w:val="24"/>
-          <w:szCs w:val="24"/>
-        </w:rPr>
-      </w:pPr>
-      <w:r>
-        <w:rPr>
-          <w:rFonts w:ascii="Times New Roman" w:hAnsi="Times New Roman"/>
-          <w:sz w:val="24"/>
-          <w:szCs w:val="24"/>
-        </w:rPr>
         <mc:AlternateContent>
           <mc:Choice Requires="wps">
             <w:drawing>
@@ -397,9 +359,9 @@
                           <a:avLst/>
                           <a:gdLst>
                             <a:gd name="textAreaLeft" fmla="*/ 0 w 810360"/>
-                            <a:gd name="textAreaRight" fmla="*/ 813960 w 810360"/>
+                            <a:gd name="textAreaRight" fmla="*/ 815040 w 810360"/>
                             <a:gd name="textAreaTop" fmla="*/ 0 h 104040"/>
-                            <a:gd name="textAreaBottom" fmla="*/ 107640 h 104040"/>
+                            <a:gd name="textAreaBottom" fmla="*/ 108720 h 104040"/>
                           </a:gdLst>
                           <a:ahLst/>
                           <a:cxnLst/>
@@ -1603,20 +1565,80 @@
         <w:ind w:hanging="0" w:start="0" w:end="-720"/>
         <w:jc w:val="start"/>
         <w:rPr>
-          <w:sz w:val="20"/>
-          <w:szCs w:val="20"/>
+          <w:sz w:val="18"/>
+          <w:szCs w:val="18"/>
         </w:rPr>
       </w:pPr>
       <w:r>
         <w:rPr>
           <w:rFonts w:ascii="Times New Roman" w:hAnsi="Times New Roman"/>
+          <w:color w:val="231F20"/>
+          <w:spacing w:val="-2"/>
+          <w:w w:val="125"/>
+          <w:sz w:val="18"/>
+          <w:szCs w:val="18"/>
+        </w:rPr>
+        <w:t xml:space="preserve">Ngày </w:t>
+      </w:r>
+      <w:r>
+        <w:rPr>
+          <w:rFonts w:ascii="Times New Roman" w:hAnsi="Times New Roman"/>
+          <w:b/>
           <w:color w:val="231F20"/>
           <w:spacing w:val="-2"/>
           <w:w w:val="125"/>
           <w:sz w:val="20"/>
-          <w:szCs w:val="20"/>
-        </w:rPr>
-        <w:t>Ngày {{ aftersale_day }} tháng {{ aftersale_month }} năm {{ aftersale_year }}</w:t>
+          <w:szCs w:val="18"/>
+        </w:rPr>
+        <w:t>{{ aftersale_day }}</w:t>
+      </w:r>
+      <w:r>
+        <w:rPr>
+          <w:rFonts w:ascii="Times New Roman" w:hAnsi="Times New Roman"/>
+          <w:b/>
+          <w:color w:val="231F20"/>
+          <w:spacing w:val="-2"/>
+          <w:w w:val="125"/>
+          <w:sz w:val="20"/>
+          <w:szCs w:val="18"/>
+        </w:rPr>
+        <w:t xml:space="preserve"> tháng </w:t>
+      </w:r>
+      <w:r>
+        <w:rPr>
+          <w:rFonts w:ascii="Times New Roman" w:hAnsi="Times New Roman"/>
+          <w:b/>
+          <w:color w:val="231F20"/>
+          <w:spacing w:val="-2"/>
+          <w:w w:val="125"/>
+          <w:sz w:val="20"/>
+          <w:szCs w:val="18"/>
+        </w:rPr>
+        <w:t>{{ aftersale_month }}</w:t>
+      </w:r>
+      <w:r>
+        <w:rPr>
+          <w:rFonts w:ascii="Times New Roman" w:hAnsi="Times New Roman"/>
+          <w:b/>
+          <w:color w:val="231F20"/>
+          <w:spacing w:val="-2"/>
+          <w:w w:val="125"/>
+          <w:sz w:val="20"/>
+          <w:szCs w:val="18"/>
+        </w:rPr>
+        <w:t xml:space="preserve"> năm </w:t>
+      </w:r>
+      <w:r>
+        <w:rPr>
+          <w:rFonts w:ascii="Times New Roman" w:hAnsi="Times New Roman"/>
+          <w:b/>
+          <w:color w:val="231F20"/>
+          <w:spacing w:val="-2"/>
+          <w:w w:val="125"/>
+          <w:sz w:val="20"/>
+          <w:szCs w:val="18"/>
+        </w:rPr>
+        <w:t>{{ aftersale_year }}</w:t>
       </w:r>
     </w:p>
     <w:p>
@@ -1650,9 +1672,8 @@
         <w:ind w:hanging="0" w:start="0" w:end="-720"/>
         <w:jc w:val="start"/>
         <w:rPr>
-          <w:rFonts w:ascii="Times New Roman" w:hAnsi="Times New Roman"/>
-          <w:sz w:val="24"/>
-          <w:szCs w:val="24"/>
+          <w:sz w:val="18"/>
+          <w:szCs w:val="18"/>
         </w:rPr>
       </w:pPr>
       <w:r>
@@ -1661,9 +1682,11 @@
           <w:b/>
           <w:color w:val="231F20"/>
           <w:w w:val="115"/>
-          <w:sz w:val="21"/>
-          <w:szCs w:val="21"/>
-        </w:rPr>
+          <w:sz w:val="18"/>
+          <w:szCs w:val="18"/>
+        </w:rPr>
+        <w:tab/>
+        <w:tab/>
         <w:t>CÔNG</w:t>
       </w:r>
       <w:r>
@@ -1673,8 +1696,8 @@
           <w:color w:val="231F20"/>
           <w:spacing w:val="-6"/>
           <w:w w:val="115"/>
-          <w:sz w:val="21"/>
-          <w:szCs w:val="21"/>
+          <w:sz w:val="18"/>
+          <w:szCs w:val="18"/>
         </w:rPr>
         <w:t xml:space="preserve"> </w:t>
       </w:r>
@@ -1684,8 +1707,8 @@
           <w:b/>
           <w:color w:val="231F20"/>
           <w:w w:val="115"/>
-          <w:sz w:val="21"/>
-          <w:szCs w:val="21"/>
+          <w:sz w:val="18"/>
+          <w:szCs w:val="18"/>
         </w:rPr>
         <w:t>TY</w:t>
       </w:r>
@@ -1696,8 +1719,8 @@
           <w:color w:val="231F20"/>
           <w:spacing w:val="-6"/>
           <w:w w:val="115"/>
-          <w:sz w:val="21"/>
-          <w:szCs w:val="21"/>
+          <w:sz w:val="18"/>
+          <w:szCs w:val="18"/>
         </w:rPr>
         <w:t xml:space="preserve"> </w:t>
       </w:r>
@@ -1707,8 +1730,8 @@
           <w:b/>
           <w:color w:val="231F20"/>
           <w:w w:val="115"/>
-          <w:sz w:val="21"/>
-          <w:szCs w:val="21"/>
+          <w:sz w:val="18"/>
+          <w:szCs w:val="18"/>
         </w:rPr>
         <w:t>CỔ</w:t>
       </w:r>
@@ -1719,8 +1742,8 @@
           <w:color w:val="231F20"/>
           <w:spacing w:val="-6"/>
           <w:w w:val="115"/>
-          <w:sz w:val="21"/>
-          <w:szCs w:val="21"/>
+          <w:sz w:val="18"/>
+          <w:szCs w:val="18"/>
         </w:rPr>
         <w:t xml:space="preserve"> </w:t>
       </w:r>
@@ -1730,8 +1753,8 @@
           <w:b/>
           <w:color w:val="231F20"/>
           <w:w w:val="115"/>
-          <w:sz w:val="21"/>
-          <w:szCs w:val="21"/>
+          <w:sz w:val="18"/>
+          <w:szCs w:val="18"/>
         </w:rPr>
         <w:t>PHẦN</w:t>
       </w:r>
@@ -1742,8 +1765,8 @@
           <w:color w:val="231F20"/>
           <w:spacing w:val="-6"/>
           <w:w w:val="115"/>
-          <w:sz w:val="21"/>
-          <w:szCs w:val="21"/>
+          <w:sz w:val="18"/>
+          <w:szCs w:val="18"/>
         </w:rPr>
         <w:t xml:space="preserve"> </w:t>
       </w:r>
@@ -1753,8 +1776,8 @@
           <w:b/>
           <w:color w:val="231F20"/>
           <w:w w:val="115"/>
-          <w:sz w:val="21"/>
-          <w:szCs w:val="21"/>
+          <w:sz w:val="18"/>
+          <w:szCs w:val="18"/>
         </w:rPr>
         <w:t>VIỄN</w:t>
       </w:r>
@@ -1765,8 +1788,8 @@
           <w:color w:val="231F20"/>
           <w:spacing w:val="-6"/>
           <w:w w:val="115"/>
-          <w:sz w:val="21"/>
-          <w:szCs w:val="21"/>
+          <w:sz w:val="18"/>
+          <w:szCs w:val="18"/>
         </w:rPr>
         <w:t xml:space="preserve"> </w:t>
       </w:r>
@@ -1776,8 +1799,8 @@
           <w:b/>
           <w:color w:val="231F20"/>
           <w:w w:val="115"/>
-          <w:sz w:val="21"/>
-          <w:szCs w:val="21"/>
+          <w:sz w:val="18"/>
+          <w:szCs w:val="18"/>
         </w:rPr>
         <w:t>THÔNG</w:t>
       </w:r>
@@ -1788,8 +1811,8 @@
           <w:color w:val="231F20"/>
           <w:spacing w:val="-6"/>
           <w:w w:val="115"/>
-          <w:sz w:val="21"/>
-          <w:szCs w:val="21"/>
+          <w:sz w:val="18"/>
+          <w:szCs w:val="18"/>
         </w:rPr>
         <w:t xml:space="preserve"> </w:t>
       </w:r>
@@ -1799,8 +1822,8 @@
           <w:b/>
           <w:color w:val="231F20"/>
           <w:w w:val="115"/>
-          <w:sz w:val="21"/>
-          <w:szCs w:val="21"/>
+          <w:sz w:val="18"/>
+          <w:szCs w:val="18"/>
         </w:rPr>
         <w:t>DI</w:t>
       </w:r>
@@ -1811,8 +1834,8 @@
           <w:color w:val="231F20"/>
           <w:spacing w:val="-6"/>
           <w:w w:val="115"/>
-          <w:sz w:val="21"/>
-          <w:szCs w:val="21"/>
+          <w:sz w:val="18"/>
+          <w:szCs w:val="18"/>
         </w:rPr>
         <w:t xml:space="preserve"> </w:t>
       </w:r>
@@ -1822,8 +1845,8 @@
           <w:b/>
           <w:color w:val="231F20"/>
           <w:w w:val="115"/>
-          <w:sz w:val="21"/>
-          <w:szCs w:val="21"/>
+          <w:sz w:val="18"/>
+          <w:szCs w:val="18"/>
         </w:rPr>
         <w:t>ĐỘNG</w:t>
       </w:r>
@@ -1834,8 +1857,8 @@
           <w:color w:val="231F20"/>
           <w:spacing w:val="-6"/>
           <w:w w:val="115"/>
-          <w:sz w:val="21"/>
-          <w:szCs w:val="21"/>
+          <w:sz w:val="18"/>
+          <w:szCs w:val="18"/>
         </w:rPr>
         <w:t xml:space="preserve"> </w:t>
       </w:r>
@@ -1846,8 +1869,8 @@
           <w:color w:val="231F20"/>
           <w:spacing w:val="-2"/>
           <w:w w:val="115"/>
-          <w:sz w:val="21"/>
-          <w:szCs w:val="21"/>
+          <w:sz w:val="18"/>
+          <w:szCs w:val="18"/>
         </w:rPr>
         <w:t>VIETNAMOBILE</w:t>
       </w:r>
@@ -1860,17 +1883,44 @@
         <w:spacing w:before="196" w:after="0"/>
         <w:ind w:hanging="0" w:start="0" w:end="0"/>
         <w:jc w:val="start"/>
-        <w:rPr/>
+        <w:rPr>
+          <w:sz w:val="18"/>
+          <w:szCs w:val="18"/>
+        </w:rPr>
       </w:pPr>
       <w:r>
         <w:rPr>
           <w:rFonts w:ascii="Times New Roman" w:hAnsi="Times New Roman"/>
           <w:color w:val="231F20"/>
           <w:w w:val="110"/>
-          <w:sz w:val="24"/>
-          <w:szCs w:val="24"/>
-        </w:rPr>
-        <w:t>Cửa hàng: Shop Xã Đàn</w:t>
+          <w:sz w:val="18"/>
+          <w:szCs w:val="18"/>
+        </w:rPr>
+        <w:tab/>
+        <w:tab/>
+        <w:t xml:space="preserve">Cửa hàng: </w:t>
+      </w:r>
+      <w:r>
+        <w:rPr>
+          <w:rFonts w:ascii="Times New Roman" w:hAnsi="Times New Roman"/>
+          <w:b/>
+          <w:bCs/>
+          <w:color w:val="231F20"/>
+          <w:w w:val="110"/>
+          <w:sz w:val="24"/>
+          <w:szCs w:val="24"/>
+        </w:rPr>
+        <w:t>Shop Xã Đàn</w:t>
+      </w:r>
+      <w:r>
+        <w:rPr>
+          <w:rFonts w:ascii="Times New Roman" w:hAnsi="Times New Roman"/>
+          <w:color w:val="231F20"/>
+          <w:w w:val="110"/>
+          <w:sz w:val="18"/>
+          <w:szCs w:val="18"/>
+        </w:rPr>
+        <w:t xml:space="preserve"> ....................................................</w:t>
       </w:r>
     </w:p>
     <w:p>
@@ -1881,16 +1931,21 @@
         <w:spacing w:before="36" w:after="0"/>
         <w:ind w:hanging="0" w:start="0" w:end="0"/>
         <w:jc w:val="start"/>
-        <w:rPr/>
+        <w:rPr>
+          <w:sz w:val="18"/>
+          <w:szCs w:val="18"/>
+        </w:rPr>
       </w:pPr>
       <w:r>
         <w:rPr>
           <w:rFonts w:ascii="Times New Roman" w:hAnsi="Times New Roman"/>
           <w:color w:val="231F20"/>
-          <w:sz w:val="24"/>
-          <w:szCs w:val="24"/>
-        </w:rPr>
-        <w:t>Địa chỉ: {{ aftersale_shop_address }}</w:t>
+          <w:sz w:val="18"/>
+          <w:szCs w:val="18"/>
+        </w:rPr>
+        <w:tab/>
+        <w:tab/>
+        <w:t>Địa chỉ: ..........................................................................................</w:t>
       </w:r>
     </w:p>
     <w:p>
@@ -1901,16 +1956,21 @@
         <w:spacing w:before="35" w:after="0"/>
         <w:ind w:hanging="0" w:start="0" w:end="0"/>
         <w:jc w:val="start"/>
-        <w:rPr/>
+        <w:rPr>
+          <w:sz w:val="18"/>
+          <w:szCs w:val="18"/>
+        </w:rPr>
       </w:pPr>
       <w:r>
         <w:rPr>
           <w:rFonts w:ascii="Times New Roman" w:hAnsi="Times New Roman"/>
           <w:color w:val="231F20"/>
-          <w:sz w:val="24"/>
-          <w:szCs w:val="24"/>
-        </w:rPr>
-        <w:t>Điện thoại: {{ aftersale_shop_phone }}</w:t>
+          <w:sz w:val="18"/>
+          <w:szCs w:val="18"/>
+        </w:rPr>
+        <w:tab/>
+        <w:tab/>
+        <w:t>Điện thoại: .....................................................................................</w:t>
       </w:r>
     </w:p>
     <w:p>
@@ -2186,12 +2246,15 @@
     <w:p>
       <w:pPr>
         <w:sectPr>
-          <w:type w:val="continuous"/>
+          <w:headerReference w:type="default" r:id="rId6"/>
+          <w:footerReference w:type="default" r:id="rId7"/>
+          <w:type w:val="nextPage"/>
           <w:pgSz w:w="11906" w:h="16838"/>
           <w:pgMar w:left="708" w:right="708" w:gutter="0" w:header="0" w:top="580" w:footer="0" w:bottom="0"/>
+          <w:pgNumType w:fmt="decimal"/>
           <w:cols w:num="2" w:equalWidth="false" w:sep="false">
-            <w:col w:w="3026" w:space="504"/>
-            <w:col w:w="6959"/>
+            <w:col w:w="2859" w:space="504"/>
+            <w:col w:w="7126"/>
           </w:cols>
           <w:formProt w:val="false"/>
           <w:textDirection w:val="lrTb"/>
@@ -2230,7 +2293,31 @@
           <w:szCs w:val="24"/>
           <w:lang w:val="vi-VN" w:eastAsia="en-US" w:bidi="ar-SA"/>
         </w:rPr>
-        <w:t>Họ và tên: {{ aftersale_customer_name }}</w:t>
+        <w:t xml:space="preserve">Họ và tên: </w:t>
+      </w:r>
+      <w:r>
+        <w:rPr>
+          <w:rFonts w:eastAsia="Calibri" w:cs="Calibri" w:ascii="Times New Roman" w:hAnsi="Times New Roman"/>
+          <w:b/>
+          <w:color w:val="231F20"/>
+          <w:kern w:val="0"/>
+          <w:sz w:val="26"/>
+          <w:szCs w:val="24"/>
+          <w:lang w:val="vi-VN" w:eastAsia="en-US" w:bidi="ar-SA"/>
+        </w:rPr>
+        <w:t>{{ aftersale_customer_name }}</w:t>
+      </w:r>
+      <w:r>
+        <w:rPr>
+          <w:rFonts w:eastAsia="Calibri" w:cs="Calibri" w:ascii="Times New Roman" w:hAnsi="Times New Roman"/>
+          <w:b w:val="0"/>
+          <w:color w:val="231F20"/>
+          <w:kern w:val="0"/>
+          <w:sz w:val="24"/>
+          <w:szCs w:val="24"/>
+          <w:lang w:val="vi-VN" w:eastAsia="en-US" w:bidi="ar-SA"/>
+        </w:rPr>
+        <w:t xml:space="preserve"> .....</w:t>
       </w:r>
     </w:p>
     <w:p>
@@ -2264,7 +2351,103 @@
           <w:szCs w:val="24"/>
           <w:lang w:val="vi-VN" w:eastAsia="en-US" w:bidi="ar-SA"/>
         </w:rPr>
-        <w:t>Số CMND/CCCD: {{ aftersale_customer_id_number }}.   Ngày cấp: {{ aftersale_customer_issue_date }}.    Nơi cấp: {{ aftersale_customer_issue_place }}</w:t>
+        <w:t xml:space="preserve">Số CMND/CCCD: </w:t>
+      </w:r>
+      <w:r>
+        <w:rPr>
+          <w:rFonts w:eastAsia="Calibri" w:cs="Calibri" w:ascii="Times New Roman" w:hAnsi="Times New Roman"/>
+          <w:b/>
+          <w:color w:val="231F20"/>
+          <w:kern w:val="0"/>
+          <w:sz w:val="26"/>
+          <w:szCs w:val="24"/>
+          <w:lang w:val="vi-VN" w:eastAsia="en-US" w:bidi="ar-SA"/>
+        </w:rPr>
+        <w:t>{{ aftersale_customer_id_number }}</w:t>
+      </w:r>
+      <w:r>
+        <w:rPr>
+          <w:rFonts w:eastAsia="Calibri" w:cs="Calibri" w:ascii="Times New Roman" w:hAnsi="Times New Roman"/>
+          <w:b w:val="0"/>
+          <w:color w:val="231F20"/>
+          <w:kern w:val="0"/>
+          <w:sz w:val="24"/>
+          <w:szCs w:val="24"/>
+          <w:lang w:val="vi-VN" w:eastAsia="en-US" w:bidi="ar-SA"/>
+        </w:rPr>
+        <w:t xml:space="preserve"> .....</w:t>
+      </w:r>
+      <w:r>
+        <w:rPr>
+          <w:rFonts w:eastAsia="Calibri" w:cs="Calibri" w:ascii="Times New Roman" w:hAnsi="Times New Roman"/>
+          <w:b w:val="0"/>
+          <w:color w:val="231F20"/>
+          <w:kern w:val="0"/>
+          <w:sz w:val="24"/>
+          <w:szCs w:val="24"/>
+          <w:lang w:val="vi-VN" w:eastAsia="en-US" w:bidi="ar-SA"/>
+        </w:rPr>
+        <w:t xml:space="preserve">.   Ngày cấp: </w:t>
+      </w:r>
+      <w:r>
+        <w:rPr>
+          <w:rFonts w:eastAsia="Calibri" w:cs="Calibri" w:ascii="Times New Roman" w:hAnsi="Times New Roman"/>
+          <w:b/>
+          <w:color w:val="231F20"/>
+          <w:kern w:val="0"/>
+          <w:sz w:val="26"/>
+          <w:szCs w:val="24"/>
+          <w:lang w:val="vi-VN" w:eastAsia="en-US" w:bidi="ar-SA"/>
+        </w:rPr>
+        <w:t>{{ aftersale_customer_issue_date }}</w:t>
+      </w:r>
+      <w:r>
+        <w:rPr>
+          <w:rFonts w:eastAsia="Calibri" w:cs="Calibri" w:ascii="Times New Roman" w:hAnsi="Times New Roman"/>
+          <w:b w:val="0"/>
+          <w:color w:val="231F20"/>
+          <w:kern w:val="0"/>
+          <w:sz w:val="24"/>
+          <w:szCs w:val="24"/>
+          <w:lang w:val="vi-VN" w:eastAsia="en-US" w:bidi="ar-SA"/>
+        </w:rPr>
+        <w:t xml:space="preserve"> .....</w:t>
+      </w:r>
+      <w:r>
+        <w:rPr>
+          <w:rFonts w:eastAsia="Calibri" w:cs="Calibri" w:ascii="Times New Roman" w:hAnsi="Times New Roman"/>
+          <w:b w:val="0"/>
+          <w:color w:val="231F20"/>
+          <w:kern w:val="0"/>
+          <w:sz w:val="24"/>
+          <w:szCs w:val="24"/>
+          <w:lang w:val="vi-VN" w:eastAsia="en-US" w:bidi="ar-SA"/>
+        </w:rPr>
+        <w:t xml:space="preserve">.    Nơi cấp: </w:t>
+      </w:r>
+      <w:r>
+        <w:rPr>
+          <w:rFonts w:eastAsia="Calibri" w:cs="Calibri" w:ascii="Times New Roman" w:hAnsi="Times New Roman"/>
+          <w:b/>
+          <w:color w:val="231F20"/>
+          <w:kern w:val="0"/>
+          <w:sz w:val="26"/>
+          <w:szCs w:val="24"/>
+          <w:lang w:val="vi-VN" w:eastAsia="en-US" w:bidi="ar-SA"/>
+        </w:rPr>
+        <w:t>{{ aftersale_customer_issue_place }}</w:t>
+      </w:r>
+      <w:r>
+        <w:rPr>
+          <w:rFonts w:eastAsia="Calibri" w:cs="Calibri" w:ascii="Times New Roman" w:hAnsi="Times New Roman"/>
+          <w:b w:val="0"/>
+          <w:color w:val="231F20"/>
+          <w:kern w:val="0"/>
+          <w:sz w:val="24"/>
+          <w:szCs w:val="24"/>
+          <w:lang w:val="vi-VN" w:eastAsia="en-US" w:bidi="ar-SA"/>
+        </w:rPr>
+        <w:t xml:space="preserve"> .....</w:t>
       </w:r>
     </w:p>
     <w:p>
@@ -2298,7 +2481,31 @@
           <w:szCs w:val="24"/>
           <w:lang w:val="vi-VN" w:eastAsia="en-US" w:bidi="ar-SA"/>
         </w:rPr>
-        <w:t>Địa chỉ: {{ aftersale_customer_address }}</w:t>
+        <w:t xml:space="preserve">Địa chỉ: </w:t>
+      </w:r>
+      <w:r>
+        <w:rPr>
+          <w:rFonts w:eastAsia="Calibri" w:cs="Calibri" w:ascii="Times New Roman" w:hAnsi="Times New Roman"/>
+          <w:b/>
+          <w:color w:val="231F20"/>
+          <w:kern w:val="0"/>
+          <w:sz w:val="26"/>
+          <w:szCs w:val="24"/>
+          <w:lang w:val="vi-VN" w:eastAsia="en-US" w:bidi="ar-SA"/>
+        </w:rPr>
+        <w:t>{{ aftersale_customer_address }}</w:t>
+      </w:r>
+      <w:r>
+        <w:rPr>
+          <w:rFonts w:eastAsia="Calibri" w:cs="Calibri" w:ascii="Times New Roman" w:hAnsi="Times New Roman"/>
+          <w:b w:val="0"/>
+          <w:color w:val="231F20"/>
+          <w:kern w:val="0"/>
+          <w:sz w:val="24"/>
+          <w:szCs w:val="24"/>
+          <w:lang w:val="vi-VN" w:eastAsia="en-US" w:bidi="ar-SA"/>
+        </w:rPr>
+        <w:t xml:space="preserve"> .....</w:t>
       </w:r>
     </w:p>
     <w:p>
@@ -2332,7 +2539,31 @@
           <w:szCs w:val="24"/>
           <w:lang w:val="vi-VN" w:eastAsia="en-US" w:bidi="ar-SA"/>
         </w:rPr>
-        <w:t>Điện thoại liên hệ cần thiết: {{ aftersale_customer_phone }}</w:t>
+        <w:t xml:space="preserve">Điện thoại liên hệ cần thiết: </w:t>
+      </w:r>
+      <w:r>
+        <w:rPr>
+          <w:rFonts w:eastAsia="Calibri" w:cs="Calibri" w:ascii="Times New Roman" w:hAnsi="Times New Roman"/>
+          <w:b/>
+          <w:color w:val="231F20"/>
+          <w:kern w:val="0"/>
+          <w:sz w:val="26"/>
+          <w:szCs w:val="24"/>
+          <w:lang w:val="vi-VN" w:eastAsia="en-US" w:bidi="ar-SA"/>
+        </w:rPr>
+        <w:t>{{ aftersale_customer_phone }}</w:t>
+      </w:r>
+      <w:r>
+        <w:rPr>
+          <w:rFonts w:eastAsia="Calibri" w:cs="Calibri" w:ascii="Times New Roman" w:hAnsi="Times New Roman"/>
+          <w:b w:val="0"/>
+          <w:color w:val="231F20"/>
+          <w:kern w:val="0"/>
+          <w:sz w:val="24"/>
+          <w:szCs w:val="24"/>
+          <w:lang w:val="vi-VN" w:eastAsia="en-US" w:bidi="ar-SA"/>
+        </w:rPr>
+        <w:t xml:space="preserve"> .....</w:t>
       </w:r>
     </w:p>
     <w:p>
@@ -2436,7 +2667,31 @@
           <w:szCs w:val="24"/>
           <w:lang w:val="vi-VN" w:eastAsia="en-US" w:bidi="ar-SA"/>
         </w:rPr>
-        <w:t>{{ other_attachment_mark }} Giấy tờ khác (nêu rõ): {{ other_attachment_value }}</w:t>
+        <w:t xml:space="preserve">{{ other_attachment_mark }} Giấy tờ khác (nêu rõ): </w:t>
+      </w:r>
+      <w:r>
+        <w:rPr>
+          <w:rFonts w:eastAsia="Calibri" w:cs="Calibri" w:ascii="Times New Roman" w:hAnsi="Times New Roman"/>
+          <w:b/>
+          <w:color w:val="231F20"/>
+          <w:kern w:val="0"/>
+          <w:sz w:val="26"/>
+          <w:szCs w:val="24"/>
+          <w:lang w:val="vi-VN" w:eastAsia="en-US" w:bidi="ar-SA"/>
+        </w:rPr>
+        <w:t>{{ other_attachment_value }}</w:t>
+      </w:r>
+      <w:r>
+        <w:rPr>
+          <w:rFonts w:eastAsia="Calibri" w:cs="Calibri" w:ascii="Times New Roman" w:hAnsi="Times New Roman"/>
+          <w:b w:val="0"/>
+          <w:color w:val="231F20"/>
+          <w:kern w:val="0"/>
+          <w:sz w:val="24"/>
+          <w:szCs w:val="24"/>
+          <w:lang w:val="vi-VN" w:eastAsia="en-US" w:bidi="ar-SA"/>
+        </w:rPr>
+        <w:t xml:space="preserve"> .....</w:t>
       </w:r>
     </w:p>
     <w:p>
@@ -2943,7 +3198,43 @@
           <w:szCs w:val="24"/>
           <w:lang w:val="vi-VN" w:eastAsia="en-US" w:bidi="ar-SA"/>
         </w:rPr>
-        <w:t>Tôi xin cam kết là chủ sở hữu của số điện thoại Vietnamobile: {{ update_subscriber_number }}. Tôi đã cung cấp cho cửa hàng SIM gốc và cam kết thuê bao không vướng bất kỳ tranh chấp nào.</w:t>
+        <w:t xml:space="preserve">Tôi xin cam kết là chủ sở hữu của số điện thoại Vietnamobile: </w:t>
+      </w:r>
+      <w:r>
+        <w:rPr>
+          <w:rFonts w:eastAsia="Calibri" w:cs="Calibri" w:ascii="Times New Roman" w:hAnsi="Times New Roman"/>
+          <w:b/>
+          <w:color w:val="231F20"/>
+          <w:kern w:val="0"/>
+          <w:sz w:val="26"/>
+          <w:szCs w:val="24"/>
+          <w:lang w:val="vi-VN" w:eastAsia="en-US" w:bidi="ar-SA"/>
+        </w:rPr>
+        <w:t>{{ update_subscriber_number }}</w:t>
+      </w:r>
+      <w:r>
+        <w:rPr>
+          <w:rFonts w:eastAsia="Calibri" w:cs="Calibri" w:ascii="Times New Roman" w:hAnsi="Times New Roman"/>
+          <w:b w:val="0"/>
+          <w:color w:val="231F20"/>
+          <w:kern w:val="0"/>
+          <w:sz w:val="24"/>
+          <w:szCs w:val="24"/>
+          <w:lang w:val="vi-VN" w:eastAsia="en-US" w:bidi="ar-SA"/>
+        </w:rPr>
+        <w:t xml:space="preserve"> .....</w:t>
+      </w:r>
+      <w:r>
+        <w:rPr>
+          <w:rFonts w:eastAsia="Calibri" w:cs="Calibri" w:ascii="Times New Roman" w:hAnsi="Times New Roman"/>
+          <w:b w:val="0"/>
+          <w:color w:val="231F20"/>
+          <w:kern w:val="0"/>
+          <w:sz w:val="24"/>
+          <w:szCs w:val="24"/>
+          <w:lang w:val="vi-VN" w:eastAsia="en-US" w:bidi="ar-SA"/>
+        </w:rPr>
+        <w:t>. Tôi đã cung cấp cho cửa hàng SIM gốc và cam kết thuê bao không vướng bất kỳ tranh chấp nào.</w:t>
       </w:r>
     </w:p>
     <w:p>
@@ -3018,7 +3309,43 @@
           <w:szCs w:val="24"/>
           <w:lang w:val="vi-VN" w:eastAsia="en-US" w:bidi="ar-SA"/>
         </w:rPr>
-        <w:t>Tôi xin cam kết là chủ sở hữu của số điện thoại Vietnamobile: {{ replace_sim_subscriber_number }}. Trong trường hợp xảy ra bất kỳ tranh chấp về việc thay SIM cho số thuê bao này, tôi cam đoan sẽ phối hợp với Vietnamobile để giải quyết.</w:t>
+        <w:t xml:space="preserve">Tôi xin cam kết là chủ sở hữu của số điện thoại Vietnamobile: </w:t>
+      </w:r>
+      <w:r>
+        <w:rPr>
+          <w:rFonts w:eastAsia="Calibri" w:cs="Calibri" w:ascii="Times New Roman" w:hAnsi="Times New Roman"/>
+          <w:b/>
+          <w:color w:val="231F20"/>
+          <w:kern w:val="0"/>
+          <w:sz w:val="26"/>
+          <w:szCs w:val="24"/>
+          <w:lang w:val="vi-VN" w:eastAsia="en-US" w:bidi="ar-SA"/>
+        </w:rPr>
+        <w:t>{{ replace_sim_subscriber_number }}</w:t>
+      </w:r>
+      <w:r>
+        <w:rPr>
+          <w:rFonts w:eastAsia="Calibri" w:cs="Calibri" w:ascii="Times New Roman" w:hAnsi="Times New Roman"/>
+          <w:b w:val="0"/>
+          <w:color w:val="231F20"/>
+          <w:kern w:val="0"/>
+          <w:sz w:val="24"/>
+          <w:szCs w:val="24"/>
+          <w:lang w:val="vi-VN" w:eastAsia="en-US" w:bidi="ar-SA"/>
+        </w:rPr>
+        <w:t xml:space="preserve"> .....</w:t>
+      </w:r>
+      <w:r>
+        <w:rPr>
+          <w:rFonts w:eastAsia="Calibri" w:cs="Calibri" w:ascii="Times New Roman" w:hAnsi="Times New Roman"/>
+          <w:b w:val="0"/>
+          <w:color w:val="231F20"/>
+          <w:kern w:val="0"/>
+          <w:sz w:val="24"/>
+          <w:szCs w:val="24"/>
+          <w:lang w:val="vi-VN" w:eastAsia="en-US" w:bidi="ar-SA"/>
+        </w:rPr>
+        <w:t>. Trong trường hợp xảy ra bất kỳ tranh chấp về việc thay SIM cho số thuê bao này, tôi cam đoan sẽ phối hợp với Vietnamobile để giải quyết.</w:t>
       </w:r>
     </w:p>
     <w:p>
@@ -3093,7 +3420,247 @@
           <w:szCs w:val="24"/>
           <w:lang w:val="vi-VN" w:eastAsia="en-US" w:bidi="ar-SA"/>
         </w:rPr>
-        <w:t>Tôi đồng ý thanh lý Hợp đồng cung cấp và sử dụng dịch vụ thông tin di động mặt đất Vietnamobile của thuê bao {{ transfer_subscriber_number }} và chuyển quyền sử dụng số thuê bao này và dịch vụ điện thoại di động trả trước cho Ông/Bà {{ transfer_new_owner_name }}, số CMND/CCCD {{ transfer_new_owner_id_number }}, ngày cấp {{ transfer_new_owner_issue_date }}, nơi cấp {{ transfer_new_owner_issue_place }} (“Chủ thuê bao mới”).</w:t>
+        <w:t xml:space="preserve">Tôi đồng ý thanh lý Hợp đồng cung cấp và sử dụng dịch vụ thông tin di động mặt đất Vietnamobile của thuê bao </w:t>
+      </w:r>
+      <w:r>
+        <w:rPr>
+          <w:rFonts w:eastAsia="Calibri" w:cs="Calibri" w:ascii="Times New Roman" w:hAnsi="Times New Roman"/>
+          <w:b w:val="0"/>
+          <w:color w:val="231F20"/>
+          <w:kern w:val="0"/>
+          <w:sz w:val="24"/>
+          <w:szCs w:val="24"/>
+          <w:lang w:val="vi-VN" w:eastAsia="en-US" w:bidi="ar-SA"/>
+        </w:rPr>
+        <w:t xml:space="preserve">..... </w:t>
+      </w:r>
+      <w:r>
+        <w:rPr>
+          <w:rFonts w:eastAsia="Calibri" w:cs="Calibri" w:ascii="Times New Roman" w:hAnsi="Times New Roman"/>
+          <w:b/>
+          <w:color w:val="231F20"/>
+          <w:kern w:val="0"/>
+          <w:sz w:val="26"/>
+          <w:szCs w:val="24"/>
+          <w:lang w:val="vi-VN" w:eastAsia="en-US" w:bidi="ar-SA"/>
+        </w:rPr>
+        <w:t>{{ transfer_subscriber_number }}</w:t>
+      </w:r>
+      <w:r>
+        <w:rPr>
+          <w:rFonts w:eastAsia="Calibri" w:cs="Calibri" w:ascii="Times New Roman" w:hAnsi="Times New Roman"/>
+          <w:b w:val="0"/>
+          <w:color w:val="231F20"/>
+          <w:kern w:val="0"/>
+          <w:sz w:val="24"/>
+          <w:szCs w:val="24"/>
+          <w:lang w:val="vi-VN" w:eastAsia="en-US" w:bidi="ar-SA"/>
+        </w:rPr>
+        <w:t xml:space="preserve"> .....</w:t>
+      </w:r>
+      <w:r>
+        <w:rPr>
+          <w:rFonts w:eastAsia="Calibri" w:cs="Calibri" w:ascii="Times New Roman" w:hAnsi="Times New Roman"/>
+          <w:b w:val="0"/>
+          <w:color w:val="231F20"/>
+          <w:kern w:val="0"/>
+          <w:sz w:val="24"/>
+          <w:szCs w:val="24"/>
+          <w:lang w:val="vi-VN" w:eastAsia="en-US" w:bidi="ar-SA"/>
+        </w:rPr>
+        <w:t xml:space="preserve"> và chuyển quyền sử dụng số thuê bao này và dịch vụ điện thoại di động trả trước cho Ông/Bà </w:t>
+      </w:r>
+      <w:r>
+        <w:rPr>
+          <w:rFonts w:eastAsia="Calibri" w:cs="Calibri" w:ascii="Times New Roman" w:hAnsi="Times New Roman"/>
+          <w:b w:val="0"/>
+          <w:color w:val="231F20"/>
+          <w:kern w:val="0"/>
+          <w:sz w:val="24"/>
+          <w:szCs w:val="24"/>
+          <w:lang w:val="vi-VN" w:eastAsia="en-US" w:bidi="ar-SA"/>
+        </w:rPr>
+        <w:t xml:space="preserve">..... </w:t>
+      </w:r>
+      <w:r>
+        <w:rPr>
+          <w:rFonts w:eastAsia="Calibri" w:cs="Calibri" w:ascii="Times New Roman" w:hAnsi="Times New Roman"/>
+          <w:b/>
+          <w:color w:val="231F20"/>
+          <w:kern w:val="0"/>
+          <w:sz w:val="26"/>
+          <w:szCs w:val="24"/>
+          <w:lang w:val="vi-VN" w:eastAsia="en-US" w:bidi="ar-SA"/>
+        </w:rPr>
+        <w:t>{{ transfer_new_owner_name }}</w:t>
+      </w:r>
+      <w:r>
+        <w:rPr>
+          <w:rFonts w:eastAsia="Calibri" w:cs="Calibri" w:ascii="Times New Roman" w:hAnsi="Times New Roman"/>
+          <w:b w:val="0"/>
+          <w:color w:val="231F20"/>
+          <w:kern w:val="0"/>
+          <w:sz w:val="24"/>
+          <w:szCs w:val="24"/>
+          <w:lang w:val="vi-VN" w:eastAsia="en-US" w:bidi="ar-SA"/>
+        </w:rPr>
+        <w:t xml:space="preserve"> .....</w:t>
+      </w:r>
+      <w:r>
+        <w:rPr>
+          <w:rFonts w:eastAsia="Calibri" w:cs="Calibri" w:ascii="Times New Roman" w:hAnsi="Times New Roman"/>
+          <w:b w:val="0"/>
+          <w:color w:val="231F20"/>
+          <w:kern w:val="0"/>
+          <w:sz w:val="24"/>
+          <w:szCs w:val="24"/>
+          <w:lang w:val="vi-VN" w:eastAsia="en-US" w:bidi="ar-SA"/>
+        </w:rPr>
+        <w:t xml:space="preserve">, số CMND/CCCD </w:t>
+      </w:r>
+      <w:r>
+        <w:rPr>
+          <w:rFonts w:eastAsia="Calibri" w:cs="Calibri" w:ascii="Times New Roman" w:hAnsi="Times New Roman"/>
+          <w:b w:val="0"/>
+          <w:color w:val="231F20"/>
+          <w:kern w:val="0"/>
+          <w:sz w:val="24"/>
+          <w:szCs w:val="24"/>
+          <w:lang w:val="vi-VN" w:eastAsia="en-US" w:bidi="ar-SA"/>
+        </w:rPr>
+        <w:t xml:space="preserve">..... </w:t>
+      </w:r>
+      <w:r>
+        <w:rPr>
+          <w:rFonts w:eastAsia="Calibri" w:cs="Calibri" w:ascii="Times New Roman" w:hAnsi="Times New Roman"/>
+          <w:b/>
+          <w:color w:val="231F20"/>
+          <w:kern w:val="0"/>
+          <w:sz w:val="26"/>
+          <w:szCs w:val="24"/>
+          <w:lang w:val="vi-VN" w:eastAsia="en-US" w:bidi="ar-SA"/>
+        </w:rPr>
+        <w:t>{{ transfer_new_owner_id_number }}</w:t>
+      </w:r>
+      <w:r>
+        <w:rPr>
+          <w:rFonts w:eastAsia="Calibri" w:cs="Calibri" w:ascii="Times New Roman" w:hAnsi="Times New Roman"/>
+          <w:b w:val="0"/>
+          <w:color w:val="231F20"/>
+          <w:kern w:val="0"/>
+          <w:sz w:val="24"/>
+          <w:szCs w:val="24"/>
+          <w:lang w:val="vi-VN" w:eastAsia="en-US" w:bidi="ar-SA"/>
+        </w:rPr>
+        <w:t xml:space="preserve"> .....</w:t>
+      </w:r>
+      <w:r>
+        <w:rPr>
+          <w:rFonts w:eastAsia="Calibri" w:cs="Calibri" w:ascii="Times New Roman" w:hAnsi="Times New Roman"/>
+          <w:b w:val="0"/>
+          <w:color w:val="231F20"/>
+          <w:kern w:val="0"/>
+          <w:sz w:val="24"/>
+          <w:szCs w:val="24"/>
+          <w:lang w:val="vi-VN" w:eastAsia="en-US" w:bidi="ar-SA"/>
+        </w:rPr>
+        <w:t xml:space="preserve">, ngày cấp </w:t>
+      </w:r>
+      <w:r>
+        <w:rPr>
+          <w:rFonts w:eastAsia="Calibri" w:cs="Calibri" w:ascii="Times New Roman" w:hAnsi="Times New Roman"/>
+          <w:b w:val="0"/>
+          <w:color w:val="231F20"/>
+          <w:kern w:val="0"/>
+          <w:sz w:val="24"/>
+          <w:szCs w:val="24"/>
+          <w:lang w:val="vi-VN" w:eastAsia="en-US" w:bidi="ar-SA"/>
+        </w:rPr>
+        <w:t xml:space="preserve">..... </w:t>
+      </w:r>
+      <w:r>
+        <w:rPr>
+          <w:rFonts w:eastAsia="Calibri" w:cs="Calibri" w:ascii="Times New Roman" w:hAnsi="Times New Roman"/>
+          <w:b/>
+          <w:color w:val="231F20"/>
+          <w:kern w:val="0"/>
+          <w:sz w:val="26"/>
+          <w:szCs w:val="24"/>
+          <w:lang w:val="vi-VN" w:eastAsia="en-US" w:bidi="ar-SA"/>
+        </w:rPr>
+        <w:t>{{ transfer_new_owner_issue_date }}</w:t>
+      </w:r>
+      <w:r>
+        <w:rPr>
+          <w:rFonts w:eastAsia="Calibri" w:cs="Calibri" w:ascii="Times New Roman" w:hAnsi="Times New Roman"/>
+          <w:b w:val="0"/>
+          <w:color w:val="231F20"/>
+          <w:kern w:val="0"/>
+          <w:sz w:val="24"/>
+          <w:szCs w:val="24"/>
+          <w:lang w:val="vi-VN" w:eastAsia="en-US" w:bidi="ar-SA"/>
+        </w:rPr>
+        <w:t xml:space="preserve"> .....</w:t>
+      </w:r>
+      <w:r>
+        <w:rPr>
+          <w:rFonts w:eastAsia="Calibri" w:cs="Calibri" w:ascii="Times New Roman" w:hAnsi="Times New Roman"/>
+          <w:b w:val="0"/>
+          <w:color w:val="231F20"/>
+          <w:kern w:val="0"/>
+          <w:sz w:val="24"/>
+          <w:szCs w:val="24"/>
+          <w:lang w:val="vi-VN" w:eastAsia="en-US" w:bidi="ar-SA"/>
+        </w:rPr>
+        <w:t xml:space="preserve">, nơi cấp </w:t>
+      </w:r>
+      <w:r>
+        <w:rPr>
+          <w:rFonts w:eastAsia="Calibri" w:cs="Calibri" w:ascii="Times New Roman" w:hAnsi="Times New Roman"/>
+          <w:b w:val="0"/>
+          <w:color w:val="231F20"/>
+          <w:kern w:val="0"/>
+          <w:sz w:val="24"/>
+          <w:szCs w:val="24"/>
+          <w:lang w:val="vi-VN" w:eastAsia="en-US" w:bidi="ar-SA"/>
+        </w:rPr>
+        <w:t xml:space="preserve">..... </w:t>
+      </w:r>
+      <w:r>
+        <w:rPr>
+          <w:rFonts w:eastAsia="Calibri" w:cs="Calibri" w:ascii="Times New Roman" w:hAnsi="Times New Roman"/>
+          <w:b/>
+          <w:color w:val="231F20"/>
+          <w:kern w:val="0"/>
+          <w:sz w:val="26"/>
+          <w:szCs w:val="24"/>
+          <w:lang w:val="vi-VN" w:eastAsia="en-US" w:bidi="ar-SA"/>
+        </w:rPr>
+        <w:t>{{ transfer_new_owner_issue_place }}</w:t>
+      </w:r>
+      <w:r>
+        <w:rPr>
+          <w:rFonts w:eastAsia="Calibri" w:cs="Calibri" w:ascii="Times New Roman" w:hAnsi="Times New Roman"/>
+          <w:b w:val="0"/>
+          <w:color w:val="231F20"/>
+          <w:kern w:val="0"/>
+          <w:sz w:val="24"/>
+          <w:szCs w:val="24"/>
+          <w:lang w:val="vi-VN" w:eastAsia="en-US" w:bidi="ar-SA"/>
+        </w:rPr>
+        <w:t xml:space="preserve"> .....</w:t>
+      </w:r>
+      <w:r>
+        <w:rPr>
+          <w:rFonts w:eastAsia="Calibri" w:cs="Calibri" w:ascii="Times New Roman" w:hAnsi="Times New Roman"/>
+          <w:b w:val="0"/>
+          <w:color w:val="231F20"/>
+          <w:kern w:val="0"/>
+          <w:sz w:val="24"/>
+          <w:szCs w:val="24"/>
+          <w:lang w:val="vi-VN" w:eastAsia="en-US" w:bidi="ar-SA"/>
+        </w:rPr>
+        <w:t xml:space="preserve"> (“Chủ thuê bao mới”).</w:t>
       </w:r>
     </w:p>
     <w:p>
@@ -3381,7 +3948,55 @@
           <w:szCs w:val="24"/>
           <w:lang w:val="vi-VN" w:eastAsia="en-US" w:bidi="ar-SA"/>
         </w:rPr>
-        <w:t>Tôi ({{ requester_role_mark }} Người yêu cầu hoặc {{ new_owner_role_mark }} Chủ thuê bao mới) là chủ sở hữu của số thuê bao {{ common_subscriber_number }}. Tôi đã được nhân viên tư vấn đầy đủ về các quyền và nghĩa vụ của gói cước đi kèm số thuê bao này và tôi đồng ý tiếp tục sử dụng và thực hiện các cam kết của gói cước theo quy định của Vietnamobile.</w:t>
+        <w:t xml:space="preserve">Tôi ({{ requester_role_mark }} Người yêu cầu hoặc {{ new_owner_role_mark }} Chủ thuê bao mới) là chủ sở hữu của số thuê bao </w:t>
+      </w:r>
+      <w:r>
+        <w:rPr>
+          <w:rFonts w:eastAsia="Calibri" w:cs="Calibri" w:ascii="Times New Roman" w:hAnsi="Times New Roman"/>
+          <w:b w:val="0"/>
+          <w:color w:val="231F20"/>
+          <w:kern w:val="0"/>
+          <w:sz w:val="24"/>
+          <w:szCs w:val="24"/>
+          <w:lang w:val="vi-VN" w:eastAsia="en-US" w:bidi="ar-SA"/>
+        </w:rPr>
+        <w:t xml:space="preserve">..... </w:t>
+      </w:r>
+      <w:r>
+        <w:rPr>
+          <w:rFonts w:eastAsia="Calibri" w:cs="Calibri" w:ascii="Times New Roman" w:hAnsi="Times New Roman"/>
+          <w:b/>
+          <w:color w:val="231F20"/>
+          <w:kern w:val="0"/>
+          <w:sz w:val="26"/>
+          <w:szCs w:val="24"/>
+          <w:lang w:val="vi-VN" w:eastAsia="en-US" w:bidi="ar-SA"/>
+        </w:rPr>
+        <w:t>{{ common_subscriber_number }}</w:t>
+      </w:r>
+      <w:r>
+        <w:rPr>
+          <w:rFonts w:eastAsia="Calibri" w:cs="Calibri" w:ascii="Times New Roman" w:hAnsi="Times New Roman"/>
+          <w:b w:val="0"/>
+          <w:color w:val="231F20"/>
+          <w:kern w:val="0"/>
+          <w:sz w:val="24"/>
+          <w:szCs w:val="24"/>
+          <w:lang w:val="vi-VN" w:eastAsia="en-US" w:bidi="ar-SA"/>
+        </w:rPr>
+        <w:t xml:space="preserve"> .....</w:t>
+      </w:r>
+      <w:r>
+        <w:rPr>
+          <w:rFonts w:eastAsia="Calibri" w:cs="Calibri" w:ascii="Times New Roman" w:hAnsi="Times New Roman"/>
+          <w:b w:val="0"/>
+          <w:color w:val="231F20"/>
+          <w:kern w:val="0"/>
+          <w:sz w:val="24"/>
+          <w:szCs w:val="24"/>
+          <w:lang w:val="vi-VN" w:eastAsia="en-US" w:bidi="ar-SA"/>
+        </w:rPr>
+        <w:t>. Tôi đã được nhân viên tư vấn đầy đủ về các quyền và nghĩa vụ của gói cước đi kèm số thuê bao này và tôi đồng ý tiếp tục sử dụng và thực hiện các cam kết của gói cước theo quy định của Vietnamobile.</w:t>
       </w:r>
     </w:p>
     <w:p>
@@ -3967,7 +4582,79 @@
           <w:szCs w:val="24"/>
           <w:lang w:val="vi-VN" w:eastAsia="en-US" w:bidi="ar-SA"/>
         </w:rPr>
-        <w:t>Tôi đồng ý để Vietnamobile thu hồi lại số thuê bao vô điều kiện hoặc áp dụng các biện pháp khác trong trường hợp tôi vi phạm điều khoản đã cam kết hoặc có bất kỳ khiếu nại nào từ chủ thuê bao cũ và/hoặc bên thứ ba khác và Vietnamobile không liên hệ được với tôi qua số điện thoại 1: {{ backup_phone_1_line }} hoặc số điện thoại 2: {{ backup_phone_2_line }} trong vòng 24 giờ. Tôi cam đoan sẽ phối hợp với Vietnamobile để giải quyết và chấp nhận quyết định cuối cùng của Vietnamobile.</w:t>
+        <w:t xml:space="preserve">Tôi đồng ý để Vietnamobile thu hồi lại số thuê bao vô điều kiện hoặc áp dụng các biện pháp khác trong trường hợp tôi vi phạm điều khoản đã cam kết hoặc có bất kỳ khiếu nại nào từ chủ thuê bao cũ và/hoặc bên thứ ba khác và Vietnamobile không liên hệ được với tôi qua số điện thoại 1: </w:t>
+      </w:r>
+      <w:r>
+        <w:rPr>
+          <w:rFonts w:eastAsia="Calibri" w:cs="Calibri" w:ascii="Times New Roman" w:hAnsi="Times New Roman"/>
+          <w:b/>
+          <w:color w:val="231F20"/>
+          <w:kern w:val="0"/>
+          <w:sz w:val="26"/>
+          <w:szCs w:val="24"/>
+          <w:lang w:val="vi-VN" w:eastAsia="en-US" w:bidi="ar-SA"/>
+        </w:rPr>
+        <w:t>{{ backup_phone_1_line }}</w:t>
+      </w:r>
+      <w:r>
+        <w:rPr>
+          <w:rFonts w:eastAsia="Calibri" w:cs="Calibri" w:ascii="Times New Roman" w:hAnsi="Times New Roman"/>
+          <w:b w:val="0"/>
+          <w:color w:val="231F20"/>
+          <w:kern w:val="0"/>
+          <w:sz w:val="24"/>
+          <w:szCs w:val="24"/>
+          <w:lang w:val="vi-VN" w:eastAsia="en-US" w:bidi="ar-SA"/>
+        </w:rPr>
+        <w:t xml:space="preserve"> .....</w:t>
+      </w:r>
+      <w:r>
+        <w:rPr>
+          <w:rFonts w:eastAsia="Calibri" w:cs="Calibri" w:ascii="Times New Roman" w:hAnsi="Times New Roman"/>
+          <w:b w:val="0"/>
+          <w:color w:val="231F20"/>
+          <w:kern w:val="0"/>
+          <w:sz w:val="24"/>
+          <w:szCs w:val="24"/>
+          <w:lang w:val="vi-VN" w:eastAsia="en-US" w:bidi="ar-SA"/>
+        </w:rPr>
+        <w:t xml:space="preserve"> hoặc số điện thoại 2: </w:t>
+      </w:r>
+      <w:r>
+        <w:rPr>
+          <w:rFonts w:eastAsia="Calibri" w:cs="Calibri" w:ascii="Times New Roman" w:hAnsi="Times New Roman"/>
+          <w:b/>
+          <w:color w:val="231F20"/>
+          <w:kern w:val="0"/>
+          <w:sz w:val="26"/>
+          <w:szCs w:val="24"/>
+          <w:lang w:val="vi-VN" w:eastAsia="en-US" w:bidi="ar-SA"/>
+        </w:rPr>
+        <w:t>{{ backup_phone_2_line }}</w:t>
+      </w:r>
+      <w:r>
+        <w:rPr>
+          <w:rFonts w:eastAsia="Calibri" w:cs="Calibri" w:ascii="Times New Roman" w:hAnsi="Times New Roman"/>
+          <w:b w:val="0"/>
+          <w:color w:val="231F20"/>
+          <w:kern w:val="0"/>
+          <w:sz w:val="24"/>
+          <w:szCs w:val="24"/>
+          <w:lang w:val="vi-VN" w:eastAsia="en-US" w:bidi="ar-SA"/>
+        </w:rPr>
+        <w:t xml:space="preserve"> .....</w:t>
+      </w:r>
+      <w:r>
+        <w:rPr>
+          <w:rFonts w:eastAsia="Calibri" w:cs="Calibri" w:ascii="Times New Roman" w:hAnsi="Times New Roman"/>
+          <w:b w:val="0"/>
+          <w:color w:val="231F20"/>
+          <w:kern w:val="0"/>
+          <w:sz w:val="24"/>
+          <w:szCs w:val="24"/>
+          <w:lang w:val="vi-VN" w:eastAsia="en-US" w:bidi="ar-SA"/>
+        </w:rPr>
+        <w:t xml:space="preserve"> trong vòng 24 giờ. Tôi cam đoan sẽ phối hợp với Vietnamobile để giải quyết và chấp nhận quyết định cuối cùng của Vietnamobile.</w:t>
       </w:r>
     </w:p>
     <w:p>
@@ -3982,387 +4669,364 @@
         </w:sectPr>
       </w:pPr>
     </w:p>
-    <w:p>
-      <w:pPr>
-        <w:pStyle w:val="Heading2"/>
-        <w:spacing w:lineRule="auto" w:line="206" w:before="0" w:after="0"/>
-        <w:ind w:start="617"/>
-        <w:rPr>
-          <w:rFonts w:ascii="Times New Roman" w:hAnsi="Times New Roman"/>
-          <w:sz w:val="24"/>
-          <w:szCs w:val="24"/>
-        </w:rPr>
-      </w:pPr>
-      <w:r>
-        <w:rPr>
-          <w:rFonts w:ascii="Times New Roman" w:hAnsi="Times New Roman"/>
-          <w:sz w:val="24"/>
-          <w:szCs w:val="24"/>
-        </w:rPr>
-        <w:t>NGƯỜI YÊU CẦU</w:t>
-      </w:r>
-    </w:p>
-    <w:p>
-      <w:pPr>
-        <w:pStyle w:val="BodyText"/>
-        <w:spacing w:lineRule="exact" w:line="290" w:before="0" w:after="0"/>
-        <w:ind w:start="492"/>
-        <w:rPr>
-          <w:rFonts w:ascii="Times New Roman" w:hAnsi="Times New Roman"/>
-          <w:sz w:val="24"/>
-          <w:szCs w:val="24"/>
-        </w:rPr>
-      </w:pPr>
-      <w:r>
-        <w:rPr>
-          <w:rFonts w:ascii="Times New Roman" w:hAnsi="Times New Roman"/>
-          <w:color w:val="231F20"/>
-          <w:spacing w:val="-2"/>
-          <w:w w:val="115"/>
-          <w:sz w:val="24"/>
-          <w:szCs w:val="24"/>
-        </w:rPr>
-        <w:t>(Ký và ghi rõ họ tên)</w:t>
-      </w:r>
-    </w:p>
-    <w:p>
-      <w:pPr>
-        <w:pStyle w:val="BodyText"/>
-        <w:spacing w:lineRule="exact" w:line="290" w:before="0" w:after="0"/>
-        <w:ind w:start="492"/>
-        <w:rPr>
-          <w:rFonts w:ascii="Times New Roman" w:hAnsi="Times New Roman"/>
-          <w:sz w:val="24"/>
-          <w:szCs w:val="24"/>
-        </w:rPr>
-      </w:pPr>
-      <w:r>
-        <w:rPr>
-          <w:rFonts w:ascii="Times New Roman" w:hAnsi="Times New Roman"/>
-          <w:sz w:val="24"/>
-          <w:szCs w:val="24"/>
-        </w:rPr>
-      </w:r>
-    </w:p>
-    <w:p>
-      <w:pPr>
-        <w:pStyle w:val="BodyText"/>
-        <w:spacing w:lineRule="exact" w:line="290" w:before="0" w:after="0"/>
-        <w:ind w:start="492"/>
-        <w:rPr>
-          <w:rFonts w:ascii="Times New Roman" w:hAnsi="Times New Roman"/>
-          <w:sz w:val="24"/>
-          <w:szCs w:val="24"/>
-        </w:rPr>
-      </w:pPr>
-      <w:r>
-        <w:rPr>
-          <w:rFonts w:ascii="Times New Roman" w:hAnsi="Times New Roman"/>
-          <w:sz w:val="24"/>
-          <w:szCs w:val="24"/>
-        </w:rPr>
-      </w:r>
-    </w:p>
-    <w:p>
-      <w:pPr>
-        <w:pStyle w:val="BodyText"/>
-        <w:spacing w:lineRule="exact" w:line="290" w:before="0" w:after="0"/>
-        <w:ind w:start="492"/>
-        <w:rPr>
-          <w:rFonts w:ascii="Times New Roman" w:hAnsi="Times New Roman"/>
-          <w:sz w:val="24"/>
-          <w:szCs w:val="24"/>
-        </w:rPr>
-      </w:pPr>
-      <w:r>
-        <w:rPr>
-          <w:rFonts w:ascii="Times New Roman" w:hAnsi="Times New Roman"/>
-          <w:sz w:val="24"/>
-          <w:szCs w:val="24"/>
-        </w:rPr>
-      </w:r>
-    </w:p>
-    <w:p>
-      <w:pPr>
-        <w:pStyle w:val="BodyText"/>
-        <w:spacing w:lineRule="exact" w:line="290" w:before="0" w:after="0"/>
-        <w:ind w:start="492"/>
-        <w:rPr>
-          <w:rFonts w:ascii="Times New Roman" w:hAnsi="Times New Roman"/>
-          <w:sz w:val="24"/>
-          <w:szCs w:val="24"/>
-        </w:rPr>
-      </w:pPr>
-      <w:r>
-        <w:rPr>
-          <w:rFonts w:ascii="Times New Roman" w:hAnsi="Times New Roman"/>
-          <w:sz w:val="24"/>
-          <w:szCs w:val="24"/>
-        </w:rPr>
-      </w:r>
-    </w:p>
-    <w:p>
-      <w:pPr>
-        <w:pStyle w:val="BodyText"/>
-        <w:spacing w:lineRule="exact" w:line="290" w:before="0" w:after="0"/>
-        <w:ind w:start="492"/>
-        <w:rPr>
-          <w:rFonts w:ascii="Times New Roman" w:hAnsi="Times New Roman"/>
-          <w:sz w:val="24"/>
-          <w:szCs w:val="24"/>
-        </w:rPr>
-      </w:pPr>
-      <w:r>
-        <w:rPr>
-          <w:rFonts w:ascii="Times New Roman" w:hAnsi="Times New Roman"/>
-          <w:sz w:val="24"/>
-          <w:szCs w:val="24"/>
-        </w:rPr>
-      </w:r>
-    </w:p>
-    <w:p>
-      <w:pPr>
-        <w:pStyle w:val="Normal"/>
+    <w:tbl>
+      <w:tblPr>
+        <w:tblW w:w="10491" w:type="dxa"/>
         <w:jc w:val="center"/>
-        <w:rPr>
-          <w:b/>
-        </w:rPr>
-      </w:pPr>
-      <w:r>
-        <w:rPr>
-          <w:b/>
-        </w:rPr>
-      </w:r>
-    </w:p>
-    <w:p>
-      <w:pPr>
-        <w:pStyle w:val="Heading2"/>
-        <w:spacing w:lineRule="auto" w:line="206" w:before="0" w:after="0"/>
-        <w:rPr>
-          <w:rFonts w:ascii="Times New Roman" w:hAnsi="Times New Roman"/>
-          <w:sz w:val="24"/>
-          <w:szCs w:val="24"/>
-        </w:rPr>
-      </w:pPr>
-      <w:r>
-        <w:br w:type="column"/>
-      </w:r>
-      <w:r>
-        <w:rPr>
-          <w:rFonts w:ascii="Times New Roman" w:hAnsi="Times New Roman"/>
-          <w:sz w:val="24"/>
-          <w:szCs w:val="24"/>
-        </w:rPr>
-        <w:t>CHỦ THUÊ BAO MỚI</w:t>
-      </w:r>
-    </w:p>
-    <w:p>
-      <w:pPr>
-        <w:pStyle w:val="BodyText"/>
-        <w:spacing w:lineRule="exact" w:line="290" w:before="0" w:after="0"/>
-        <w:ind w:start="568"/>
-        <w:rPr>
-          <w:rFonts w:ascii="Times New Roman" w:hAnsi="Times New Roman"/>
-          <w:sz w:val="24"/>
-          <w:szCs w:val="24"/>
-        </w:rPr>
-      </w:pPr>
-      <w:r>
-        <w:rPr>
-          <w:rFonts w:ascii="Times New Roman" w:hAnsi="Times New Roman"/>
-          <w:color w:val="231F20"/>
-          <w:spacing w:val="-2"/>
-          <w:w w:val="115"/>
-          <w:sz w:val="24"/>
-          <w:szCs w:val="24"/>
-        </w:rPr>
-        <w:t>(Ký và ghi rõ họ tên)</w:t>
-      </w:r>
-    </w:p>
-    <w:p>
-      <w:pPr>
-        <w:pStyle w:val="Heading2"/>
-        <w:widowControl w:val="false"/>
-        <w:suppressAutoHyphens w:val="true"/>
-        <w:bidi w:val="0"/>
-        <w:spacing w:lineRule="auto" w:line="206" w:before="0" w:after="0"/>
-        <w:jc w:val="center"/>
-        <w:rPr>
-          <w:rFonts w:ascii="Times New Roman" w:hAnsi="Times New Roman" w:eastAsia="Calibri" w:cs="Calibri" w:eastAsiaTheme="minorHAnsi"/>
-          <w:color w:val="auto"/>
-          <w:kern w:val="0"/>
-          <w:lang w:val="vi-VN" w:eastAsia="en-US" w:bidi="ar-SA"/>
-        </w:rPr>
-      </w:pPr>
-      <w:r>
-        <w:br w:type="column"/>
-      </w:r>
-      <w:r>
-        <w:rPr>
-          <w:rFonts w:eastAsia="Calibri" w:cs="Calibri" w:ascii="Times New Roman" w:hAnsi="Times New Roman" w:eastAsiaTheme="minorHAnsi"/>
-          <w:color w:val="auto"/>
-          <w:kern w:val="0"/>
-          <w:lang w:val="vi-VN" w:eastAsia="en-US" w:bidi="ar-SA"/>
-        </w:rPr>
-        <w:t>GIAO DỊCH VIÊN</w:t>
-      </w:r>
-    </w:p>
-    <w:p>
-      <w:pPr>
-        <w:pStyle w:val="BodyText"/>
-        <w:widowControl w:val="false"/>
-        <w:suppressAutoHyphens w:val="true"/>
-        <w:bidi w:val="0"/>
-        <w:spacing w:lineRule="exact" w:line="290" w:before="0" w:after="0"/>
-        <w:ind w:start="568"/>
-        <w:jc w:val="center"/>
-        <w:rPr>
-          <w:rFonts w:ascii="Times New Roman" w:hAnsi="Times New Roman" w:eastAsia="Calibri" w:cs="Calibri"/>
-          <w:color w:val="231F20"/>
-          <w:spacing w:val="-2"/>
-          <w:w w:val="115"/>
-          <w:kern w:val="0"/>
-          <w:lang w:val="vi-VN" w:eastAsia="en-US" w:bidi="ar-SA"/>
-        </w:rPr>
-      </w:pPr>
-      <w:r>
-        <w:rPr>
-          <w:rFonts w:eastAsia="Calibri" w:cs="Calibri" w:ascii="Times New Roman" w:hAnsi="Times New Roman"/>
-          <w:color w:val="231F20"/>
-          <w:spacing w:val="-2"/>
-          <w:w w:val="115"/>
-          <w:kern w:val="0"/>
-          <w:lang w:val="vi-VN" w:eastAsia="en-US" w:bidi="ar-SA"/>
-        </w:rPr>
-        <w:t>(Ký và ghi rõ họ tên)</w:t>
-      </w:r>
-    </w:p>
-    <w:p>
-      <w:pPr>
-        <w:pStyle w:val="Heading2"/>
-        <w:spacing w:before="0" w:after="0"/>
-        <w:rPr>
-          <w:rFonts w:ascii="Times New Roman" w:hAnsi="Times New Roman"/>
-          <w:sz w:val="24"/>
-          <w:szCs w:val="24"/>
-        </w:rPr>
-      </w:pPr>
-      <w:r>
-        <w:rPr>
-          <w:rFonts w:ascii="Times New Roman" w:hAnsi="Times New Roman"/>
-          <w:sz w:val="24"/>
-          <w:szCs w:val="24"/>
-        </w:rPr>
-      </w:r>
-    </w:p>
-    <w:p>
-      <w:pPr>
-        <w:pStyle w:val="Heading2"/>
-        <w:spacing w:before="0" w:after="0"/>
-        <w:rPr>
-          <w:rFonts w:ascii="Times New Roman" w:hAnsi="Times New Roman"/>
-          <w:sz w:val="24"/>
-          <w:szCs w:val="24"/>
-        </w:rPr>
-      </w:pPr>
-      <w:r>
-        <w:rPr>
-          <w:rFonts w:ascii="Times New Roman" w:hAnsi="Times New Roman"/>
-          <w:sz w:val="24"/>
-          <w:szCs w:val="24"/>
-        </w:rPr>
-      </w:r>
-    </w:p>
-    <w:p>
-      <w:pPr>
-        <w:pStyle w:val="Heading2"/>
-        <w:spacing w:before="0" w:after="0"/>
-        <w:rPr>
-          <w:rFonts w:ascii="Times New Roman" w:hAnsi="Times New Roman"/>
-          <w:sz w:val="24"/>
-          <w:szCs w:val="24"/>
-        </w:rPr>
-      </w:pPr>
-      <w:r>
-        <w:rPr>
-          <w:rFonts w:ascii="Times New Roman" w:hAnsi="Times New Roman"/>
-          <w:sz w:val="24"/>
-          <w:szCs w:val="24"/>
-        </w:rPr>
-      </w:r>
-    </w:p>
-    <w:p>
-      <w:pPr>
-        <w:pStyle w:val="Heading2"/>
-        <w:spacing w:before="0" w:after="0"/>
-        <w:ind w:hanging="0" w:start="0"/>
-        <w:rPr>
-          <w:rFonts w:ascii="Times New Roman" w:hAnsi="Times New Roman"/>
-          <w:sz w:val="24"/>
-          <w:szCs w:val="24"/>
-        </w:rPr>
-      </w:pPr>
-      <w:r>
-        <w:rPr>
-          <w:rFonts w:ascii="Times New Roman" w:hAnsi="Times New Roman"/>
-          <w:sz w:val="24"/>
-          <w:szCs w:val="24"/>
-        </w:rPr>
-      </w:r>
-    </w:p>
-    <w:p>
-      <w:pPr>
-        <w:pStyle w:val="Heading2"/>
-        <w:spacing w:before="0" w:after="0"/>
-        <w:ind w:hanging="0" w:start="0"/>
-        <w:rPr>
-          <w:rFonts w:ascii="Times New Roman" w:hAnsi="Times New Roman"/>
-          <w:sz w:val="24"/>
-          <w:szCs w:val="24"/>
-        </w:rPr>
-      </w:pPr>
-      <w:r>
-        <w:rPr>
-          <w:rFonts w:ascii="Times New Roman" w:hAnsi="Times New Roman"/>
-          <w:sz w:val="24"/>
-          <w:szCs w:val="24"/>
-        </w:rPr>
-      </w:r>
-    </w:p>
-    <w:p>
-      <w:pPr>
-        <w:pStyle w:val="Heading2"/>
-        <w:spacing w:before="0" w:after="0"/>
-        <w:ind w:hanging="0" w:start="0"/>
-        <w:rPr>
-          <w:rFonts w:ascii="Times New Roman" w:hAnsi="Times New Roman"/>
-          <w:sz w:val="24"/>
-          <w:szCs w:val="24"/>
-        </w:rPr>
-      </w:pPr>
-      <w:r>
-        <w:rPr>
-          <w:rFonts w:ascii="Times New Roman" w:hAnsi="Times New Roman"/>
-          <w:sz w:val="24"/>
-          <w:szCs w:val="24"/>
-        </w:rPr>
-      </w:r>
-    </w:p>
+        <w:tblInd w:w="0" w:type="dxa"/>
+        <w:tblLayout w:type="fixed"/>
+        <w:tblCellMar>
+          <w:top w:w="60" w:type="dxa"/>
+          <w:start w:w="108" w:type="dxa"/>
+          <w:bottom w:w="60" w:type="dxa"/>
+          <w:end w:w="108" w:type="dxa"/>
+        </w:tblCellMar>
+        <w:tblLook w:noHBand="0" w:noVBand="1" w:firstColumn="1" w:lastRow="0" w:lastColumn="0" w:firstRow="1" w:val="04a0"/>
+      </w:tblPr>
+      <w:tblGrid>
+        <w:gridCol w:w="3497"/>
+        <w:gridCol w:w="3497"/>
+        <w:gridCol w:w="3497"/>
+      </w:tblGrid>
+      <w:tr>
+        <w:trPr/>
+        <w:tc>
+          <w:tcPr>
+            <w:tcW w:w="3497" w:type="dxa"/>
+            <w:tcBorders/>
+            <w:vAlign w:val="center"/>
+          </w:tcPr>
+          <w:p>
+            <w:pPr>
+              <w:pStyle w:val="Normal"/>
+              <w:jc w:val="center"/>
+              <w:rPr>
+                <w:sz w:val="24"/>
+                <w:szCs w:val="24"/>
+              </w:rPr>
+            </w:pPr>
+            <w:r>
+              <w:rPr>
+                <w:b/>
+                <w:i w:val="false"/>
+                <w:sz w:val="24"/>
+                <w:szCs w:val="24"/>
+              </w:rPr>
+              <w:t>NGƯỜI YÊU CẦU</w:t>
+            </w:r>
+          </w:p>
+          <w:p>
+            <w:pPr>
+              <w:pStyle w:val="Normal"/>
+              <w:jc w:val="center"/>
+              <w:rPr>
+                <w:sz w:val="24"/>
+                <w:szCs w:val="24"/>
+              </w:rPr>
+            </w:pPr>
+            <w:r>
+              <w:rPr>
+                <w:b w:val="false"/>
+                <w:i/>
+                <w:sz w:val="24"/>
+                <w:szCs w:val="24"/>
+              </w:rPr>
+              <w:t>(Ký và ghi rõ họ tên)</w:t>
+            </w:r>
+          </w:p>
+        </w:tc>
+        <w:tc>
+          <w:tcPr>
+            <w:tcW w:w="3497" w:type="dxa"/>
+            <w:tcBorders/>
+            <w:vAlign w:val="center"/>
+          </w:tcPr>
+          <w:p>
+            <w:pPr>
+              <w:pStyle w:val="Normal"/>
+              <w:jc w:val="center"/>
+              <w:rPr>
+                <w:sz w:val="24"/>
+                <w:szCs w:val="24"/>
+              </w:rPr>
+            </w:pPr>
+            <w:r>
+              <w:rPr>
+                <w:b/>
+                <w:i w:val="false"/>
+                <w:sz w:val="24"/>
+                <w:szCs w:val="24"/>
+              </w:rPr>
+              <w:t>CHỦ THUÊ BAO MỚI</w:t>
+            </w:r>
+          </w:p>
+          <w:p>
+            <w:pPr>
+              <w:pStyle w:val="Normal"/>
+              <w:jc w:val="center"/>
+              <w:rPr>
+                <w:sz w:val="24"/>
+                <w:szCs w:val="24"/>
+              </w:rPr>
+            </w:pPr>
+            <w:r>
+              <w:rPr>
+                <w:b w:val="false"/>
+                <w:i/>
+                <w:sz w:val="24"/>
+                <w:szCs w:val="24"/>
+              </w:rPr>
+              <w:t>(Ký và ghi rõ họ tên)</w:t>
+            </w:r>
+          </w:p>
+        </w:tc>
+        <w:tc>
+          <w:tcPr>
+            <w:tcW w:w="3497" w:type="dxa"/>
+            <w:tcBorders/>
+            <w:vAlign w:val="center"/>
+          </w:tcPr>
+          <w:p>
+            <w:pPr>
+              <w:pStyle w:val="Normal"/>
+              <w:jc w:val="center"/>
+              <w:rPr>
+                <w:sz w:val="24"/>
+                <w:szCs w:val="24"/>
+              </w:rPr>
+            </w:pPr>
+            <w:r>
+              <w:rPr>
+                <w:b/>
+                <w:i w:val="false"/>
+                <w:sz w:val="24"/>
+                <w:szCs w:val="24"/>
+              </w:rPr>
+              <w:t>GIAO DỊCH VIÊN</w:t>
+            </w:r>
+          </w:p>
+          <w:p>
+            <w:pPr>
+              <w:pStyle w:val="Normal"/>
+              <w:jc w:val="center"/>
+              <w:rPr>
+                <w:sz w:val="24"/>
+                <w:szCs w:val="24"/>
+              </w:rPr>
+            </w:pPr>
+            <w:r>
+              <w:rPr>
+                <w:b w:val="false"/>
+                <w:i/>
+                <w:sz w:val="24"/>
+                <w:szCs w:val="24"/>
+              </w:rPr>
+              <w:t>(Ký và ghi rõ họ tên)</w:t>
+            </w:r>
+          </w:p>
+        </w:tc>
+      </w:tr>
+      <w:tr>
+        <w:trPr>
+          <w:trHeight w:val="1814" w:hRule="exact"/>
+        </w:trPr>
+        <w:tc>
+          <w:tcPr>
+            <w:tcW w:w="3497" w:type="dxa"/>
+            <w:tcBorders/>
+            <w:tcMar>
+              <w:top w:w="20" w:type="dxa"/>
+              <w:bottom w:w="20" w:type="dxa"/>
+            </w:tcMar>
+            <w:vAlign w:val="center"/>
+          </w:tcPr>
+          <w:p>
+            <w:pPr>
+              <w:jc w:val="center"/>
+            </w:pPr>
+            <w:r/>
+            <w:r>
+              <w:rPr>
+                <w:rFonts w:ascii="Great Vibes" w:hAnsi="Great Vibes" w:eastAsia="Great Vibes" w:cs="Great Vibes"/>
+                <w:b w:val="0"/>
+                <w:sz w:val="36"/>
+              </w:rPr>
+              <w:t>{{ aftersale_requester_signature_given_name }}</w:t>
+            </w:r>
+          </w:p>
+        </w:tc>
+        <w:tc>
+          <w:tcPr>
+            <w:tcW w:w="3497" w:type="dxa"/>
+            <w:tcBorders/>
+            <w:tcMar>
+              <w:top w:w="20" w:type="dxa"/>
+              <w:bottom w:w="20" w:type="dxa"/>
+            </w:tcMar>
+            <w:vAlign w:val="center"/>
+          </w:tcPr>
+          <w:p>
+            <w:pPr>
+              <w:jc w:val="center"/>
+            </w:pPr>
+            <w:r/>
+            <w:r>
+              <w:rPr>
+                <w:rFonts w:ascii="Great Vibes" w:hAnsi="Great Vibes" w:eastAsia="Great Vibes" w:cs="Great Vibes"/>
+                <w:b w:val="0"/>
+                <w:sz w:val="36"/>
+              </w:rPr>
+              <w:t>{{ aftersale_new_owner_signature_given_name }}</w:t>
+            </w:r>
+          </w:p>
+        </w:tc>
+        <w:tc>
+          <w:tcPr>
+            <w:tcW w:w="3497" w:type="dxa"/>
+            <w:tcBorders/>
+            <w:tcMar>
+              <w:top w:w="20" w:type="dxa"/>
+              <w:bottom w:w="20" w:type="dxa"/>
+            </w:tcMar>
+            <w:vAlign w:val="center"/>
+          </w:tcPr>
+          <w:p>
+            <w:pPr>
+              <w:jc w:val="center"/>
+            </w:pPr>
+            <w:r/>
+            <w:r>
+              <w:rPr>
+                <w:rFonts w:ascii="Great Vibes" w:hAnsi="Great Vibes" w:eastAsia="Great Vibes" w:cs="Great Vibes"/>
+                <w:b w:val="0"/>
+                <w:sz w:val="36"/>
+              </w:rPr>
+              <w:t>{{ aftersale_clerk_signature_given_name }}</w:t>
+            </w:r>
+          </w:p>
+        </w:tc>
+      </w:tr>
+      <w:tr>
+        <w:trPr/>
+        <w:tc>
+          <w:tcPr>
+            <w:tcW w:w="3497" w:type="dxa"/>
+            <w:tcBorders/>
+            <w:tcMar>
+              <w:top w:w="10" w:type="dxa"/>
+            </w:tcMar>
+          </w:tcPr>
+          <w:p>
+            <w:pPr>
+              <w:pStyle w:val="Normal"/>
+              <w:jc w:val="center"/>
+              <w:rPr>
+                <w:sz w:val="24"/>
+                <w:szCs w:val="24"/>
+              </w:rPr>
+            </w:pPr>
+            <w:r>
+              <w:rPr>
+                <w:rFonts w:ascii="Great Vibes" w:hAnsi="Great Vibes" w:eastAsia="Great Vibes" w:cs="Great Vibes"/>
+                <w:b w:val="0"/>
+                <w:i w:val="false"/>
+                <w:sz w:val="36"/>
+                <w:szCs w:val="24"/>
+              </w:rPr>
+              <w:t>{{ aftersale_requester_signature_name }}</w:t>
+            </w:r>
+          </w:p>
+        </w:tc>
+        <w:tc>
+          <w:tcPr>
+            <w:tcW w:w="3497" w:type="dxa"/>
+            <w:tcBorders/>
+            <w:tcMar>
+              <w:top w:w="10" w:type="dxa"/>
+            </w:tcMar>
+          </w:tcPr>
+          <w:p>
+            <w:pPr>
+              <w:pStyle w:val="Normal"/>
+              <w:jc w:val="center"/>
+              <w:rPr>
+                <w:sz w:val="24"/>
+                <w:szCs w:val="24"/>
+              </w:rPr>
+            </w:pPr>
+            <w:r>
+              <w:rPr>
+                <w:rFonts w:ascii="Great Vibes" w:hAnsi="Great Vibes" w:eastAsia="Great Vibes" w:cs="Great Vibes"/>
+                <w:b w:val="0"/>
+                <w:i w:val="false"/>
+                <w:sz w:val="36"/>
+                <w:szCs w:val="24"/>
+              </w:rPr>
+              <w:t>{{ aftersale_new_owner_signature_name }}</w:t>
+            </w:r>
+          </w:p>
+        </w:tc>
+        <w:tc>
+          <w:tcPr>
+            <w:tcW w:w="3497" w:type="dxa"/>
+            <w:tcBorders/>
+            <w:tcMar>
+              <w:top w:w="10" w:type="dxa"/>
+            </w:tcMar>
+          </w:tcPr>
+          <w:p>
+            <w:pPr>
+              <w:pStyle w:val="Normal"/>
+              <w:jc w:val="center"/>
+              <w:rPr>
+                <w:sz w:val="24"/>
+                <w:szCs w:val="24"/>
+              </w:rPr>
+            </w:pPr>
+            <w:r>
+              <w:rPr>
+                <w:rFonts w:ascii="Great Vibes" w:hAnsi="Great Vibes" w:eastAsia="Great Vibes" w:cs="Great Vibes"/>
+                <w:b w:val="0"/>
+                <w:i w:val="false"/>
+                <w:sz w:val="36"/>
+                <w:szCs w:val="24"/>
+              </w:rPr>
+              <w:t>{{ aftersale_clerk_signature_name }}</w:t>
+            </w:r>
+          </w:p>
+        </w:tc>
+      </w:tr>
+    </w:tbl>
     <w:sectPr>
       <w:type w:val="continuous"/>
       <w:pgSz w:w="11906" w:h="16838"/>
       <w:pgMar w:left="708" w:right="708" w:gutter="0" w:header="0" w:top="580" w:footer="0" w:bottom="0"/>
-      <w:cols w:num="3" w:equalWidth="false" w:sep="false">
-        <w:col w:w="3014" w:space="712"/>
-        <w:col w:w="2987" w:space="714"/>
-        <w:col w:w="3061"/>
-      </w:cols>
       <w:formProt w:val="false"/>
       <w:textDirection w:val="lrTb"/>
       <w:docGrid w:type="default" w:linePitch="600" w:charSpace="36864"/>
     </w:sectPr>
   </w:body>
 </w:document>
+</file>
+
+<file path=word/footer1.xml><?xml version="1.0" encoding="utf-8"?>
+<w:ftr xmlns:m="http://schemas.openxmlformats.org/officeDocument/2006/math" xmlns:mc="http://schemas.openxmlformats.org/markup-compatibility/2006" xmlns:mo="http://schemas.microsoft.com/office/mac/office/2008/main" xmlns:mv="urn:schemas-microsoft-com:mac:vml" xmlns:o="urn:schemas-microsoft-com:office:office" xmlns:r="http://schemas.openxmlformats.org/officeDocument/2006/relationships" xmlns:v="urn:schemas-microsoft-com:vml" xmlns:w10="urn:schemas-microsoft-com:office:word" xmlns:w14="http://schemas.microsoft.com/office/word/2010/wordml" xmlns:w="http://schemas.openxmlformats.org/wordprocessingml/2006/main" xmlns:wne="http://schemas.microsoft.com/office/word/2006/wordml" xmlns:wp14="http://schemas.microsoft.com/office/word/2010/wordprocessingDrawing" xmlns:wp="http://schemas.openxmlformats.org/drawingml/2006/wordprocessingDrawing" xmlns:wpc="http://schemas.microsoft.com/office/word/2010/wordprocessingCanvas" xmlns:wpg="http://schemas.microsoft.com/office/word/2010/wordprocessingGroup" xmlns:wpi="http://schemas.microsoft.com/office/word/2010/wordprocessingInk" xmlns:wps="http://schemas.microsoft.com/office/word/2010/wordprocessingShape" mc:Ignorable="w14 wp14">
+  <w:p>
+    <w:pPr>
+      <w:pStyle w:val="Footer"/>
+    </w:pPr>
+  </w:p>
+</w:ftr>
+</file>
+
+<file path=word/header1.xml><?xml version="1.0" encoding="utf-8"?>
+<w:hdr xmlns:m="http://schemas.openxmlformats.org/officeDocument/2006/math" xmlns:mc="http://schemas.openxmlformats.org/markup-compatibility/2006" xmlns:mo="http://schemas.microsoft.com/office/mac/office/2008/main" xmlns:mv="urn:schemas-microsoft-com:mac:vml" xmlns:o="urn:schemas-microsoft-com:office:office" xmlns:r="http://schemas.openxmlformats.org/officeDocument/2006/relationships" xmlns:v="urn:schemas-microsoft-com:vml" xmlns:w10="urn:schemas-microsoft-com:office:word" xmlns:w14="http://schemas.microsoft.com/office/word/2010/wordml" xmlns:w="http://schemas.openxmlformats.org/wordprocessingml/2006/main" xmlns:wne="http://schemas.microsoft.com/office/word/2006/wordml" xmlns:wp14="http://schemas.microsoft.com/office/word/2010/wordprocessingDrawing" xmlns:wp="http://schemas.openxmlformats.org/drawingml/2006/wordprocessingDrawing" xmlns:wpc="http://schemas.microsoft.com/office/word/2010/wordprocessingCanvas" xmlns:wpg="http://schemas.microsoft.com/office/word/2010/wordprocessingGroup" xmlns:wpi="http://schemas.microsoft.com/office/word/2010/wordprocessingInk" xmlns:wps="http://schemas.microsoft.com/office/word/2010/wordprocessingShape" mc:Ignorable="w14 wp14">
+  <w:p>
+    <w:pPr>
+      <w:pStyle w:val="Header"/>
+    </w:pPr>
+  </w:p>
+</w:hdr>
 </file>
 
 <file path=word/numbering.xml><?xml version="1.0" encoding="utf-8"?>
@@ -5425,15 +6089,15 @@
       <w:szCs w:val="18"/>
     </w:rPr>
   </w:style>
-  <w:style w:type="paragraph" w:styleId="FrameContentsuser">
-    <w:name w:val="Frame Contents (user)"/>
+  <w:style w:type="paragraph" w:styleId="FrameContents">
+    <w:name w:val="Frame Contents"/>
     <w:basedOn w:val="Normal"/>
     <w:qFormat/>
     <w:pPr/>
     <w:rPr/>
   </w:style>
-  <w:style w:type="paragraph" w:styleId="FrameContents">
-    <w:name w:val="Frame Contents"/>
+  <w:style w:type="paragraph" w:styleId="FrameContentsuser">
+    <w:name w:val="Frame Contents (user)"/>
     <w:basedOn w:val="Normal"/>
     <w:qFormat/>
     <w:pPr/>

</xml_diff>

<commit_message>
Move template footnotes into real OOXML footnotes; bake data-value font
Adds real w:footnoteReference/footnotes.xml footnotes to transfer,
prepaid_contract, and sim_change_form (each note now stays paired with
whatever page its own reference mark lands on) after re-verifying under
this app's actual LibreOffice render pipeline that the earlier
footer-based workaround's premise -- real footnotes silently breaking
across page splits -- no longer reproduces. Adds a JetBrainsMono NF
ExtraBold font pass over every text/number/name placeholder's baked run
across all 5 templates (renderer.py falls back a still-blank field's own
dots to Times New Roman so an empty field doesn't inherit the data font),
and removes the decorative "....." dots bake_field_highlighting.py used
to bake around filled placeholder values.

Co-Authored-By: Claude Sonnet 5 <noreply@anthropic.com>
</commit_message>
<xml_diff>
--- a/desktop_app/backend/documents/aftersale/00_MAU_CAM_KET_SAU_BAN_HANG.docx
+++ b/desktop_app/backend/documents/aftersale/00_MAU_CAM_KET_SAU_BAN_HANG.docx
@@ -45,9 +45,9 @@
                             <a:avLst/>
                             <a:gdLst>
                               <a:gd name="textAreaLeft" fmla="*/ 0 w 396360"/>
-                              <a:gd name="textAreaRight" fmla="*/ 401040 w 396360"/>
+                              <a:gd name="textAreaRight" fmla="*/ 401760 w 396360"/>
                               <a:gd name="textAreaTop" fmla="*/ 0 h 187200"/>
-                              <a:gd name="textAreaBottom" fmla="*/ 191880 h 187200"/>
+                              <a:gd name="textAreaBottom" fmla="*/ 192600 h 187200"/>
                             </a:gdLst>
                             <a:ahLst/>
                             <a:cxnLst/>
@@ -359,9 +359,9 @@
                           <a:avLst/>
                           <a:gdLst>
                             <a:gd name="textAreaLeft" fmla="*/ 0 w 810360"/>
-                            <a:gd name="textAreaRight" fmla="*/ 815040 w 810360"/>
+                            <a:gd name="textAreaRight" fmla="*/ 815760 w 810360"/>
                             <a:gd name="textAreaTop" fmla="*/ 0 h 104040"/>
-                            <a:gd name="textAreaBottom" fmla="*/ 108720 h 104040"/>
+                            <a:gd name="textAreaBottom" fmla="*/ 109440 h 104040"/>
                           </a:gdLst>
                           <a:ahLst/>
                           <a:cxnLst/>
@@ -1590,55 +1590,7 @@
           <w:sz w:val="20"/>
           <w:szCs w:val="18"/>
         </w:rPr>
-        <w:t>{{ aftersale_day }}</w:t>
-      </w:r>
-      <w:r>
-        <w:rPr>
-          <w:rFonts w:ascii="Times New Roman" w:hAnsi="Times New Roman"/>
-          <w:b/>
-          <w:color w:val="231F20"/>
-          <w:spacing w:val="-2"/>
-          <w:w w:val="125"/>
-          <w:sz w:val="20"/>
-          <w:szCs w:val="18"/>
-        </w:rPr>
-        <w:t xml:space="preserve"> tháng </w:t>
-      </w:r>
-      <w:r>
-        <w:rPr>
-          <w:rFonts w:ascii="Times New Roman" w:hAnsi="Times New Roman"/>
-          <w:b/>
-          <w:color w:val="231F20"/>
-          <w:spacing w:val="-2"/>
-          <w:w w:val="125"/>
-          <w:sz w:val="20"/>
-          <w:szCs w:val="18"/>
-        </w:rPr>
-        <w:t>{{ aftersale_month }}</w:t>
-      </w:r>
-      <w:r>
-        <w:rPr>
-          <w:rFonts w:ascii="Times New Roman" w:hAnsi="Times New Roman"/>
-          <w:b/>
-          <w:color w:val="231F20"/>
-          <w:spacing w:val="-2"/>
-          <w:w w:val="125"/>
-          <w:sz w:val="20"/>
-          <w:szCs w:val="18"/>
-        </w:rPr>
-        <w:t xml:space="preserve"> năm </w:t>
-      </w:r>
-      <w:r>
-        <w:rPr>
-          <w:rFonts w:ascii="Times New Roman" w:hAnsi="Times New Roman"/>
-          <w:b/>
-          <w:color w:val="231F20"/>
-          <w:spacing w:val="-2"/>
-          <w:w w:val="125"/>
-          <w:sz w:val="20"/>
-          <w:szCs w:val="18"/>
-        </w:rPr>
-        <w:t>{{ aftersale_year }}</w:t>
+        <w:t>{{ aftersale_day }} tháng {{ aftersale_month }} năm {{ aftersale_year }}</w:t>
       </w:r>
     </w:p>
     <w:p>
@@ -1650,16 +1602,19 @@
         <w:ind w:hanging="0" w:start="0" w:end="-720"/>
         <w:jc w:val="start"/>
         <w:rPr>
-          <w:rFonts w:ascii="Times New Roman" w:hAnsi="Times New Roman"/>
-          <w:sz w:val="24"/>
-          <w:szCs w:val="24"/>
+          <w:sz w:val="18"/>
+          <w:szCs w:val="18"/>
         </w:rPr>
       </w:pPr>
       <w:r>
         <w:rPr>
           <w:rFonts w:ascii="Times New Roman" w:hAnsi="Times New Roman"/>
-          <w:sz w:val="24"/>
-          <w:szCs w:val="24"/>
+          <w:b/>
+          <w:color w:val="231F20"/>
+          <w:spacing w:val="-2"/>
+          <w:w w:val="125"/>
+          <w:sz w:val="20"/>
+          <w:szCs w:val="18"/>
         </w:rPr>
       </w:r>
     </w:p>
@@ -1685,6 +1640,30 @@
           <w:sz w:val="18"/>
           <w:szCs w:val="18"/>
         </w:rPr>
+      </w:r>
+    </w:p>
+    <w:p>
+      <w:pPr>
+        <w:pStyle w:val="Normal"/>
+        <w:widowControl w:val="false"/>
+        <w:bidi w:val="0"/>
+        <w:spacing w:before="103" w:after="0"/>
+        <w:ind w:hanging="0" w:start="0" w:end="-720"/>
+        <w:jc w:val="start"/>
+        <w:rPr>
+          <w:sz w:val="18"/>
+          <w:szCs w:val="18"/>
+        </w:rPr>
+      </w:pPr>
+      <w:r>
+        <w:rPr>
+          <w:rFonts w:ascii="Times New Roman" w:hAnsi="Times New Roman"/>
+          <w:b/>
+          <w:color w:val="231F20"/>
+          <w:w w:val="115"/>
+          <w:sz w:val="18"/>
+          <w:szCs w:val="18"/>
+        </w:rPr>
         <w:tab/>
         <w:tab/>
         <w:t>CÔNG</w:t>
@@ -1889,38 +1868,9 @@
         </w:rPr>
       </w:pPr>
       <w:r>
-        <w:rPr>
-          <w:rFonts w:ascii="Times New Roman" w:hAnsi="Times New Roman"/>
-          <w:color w:val="231F20"/>
-          <w:w w:val="110"/>
-          <w:sz w:val="18"/>
-          <w:szCs w:val="18"/>
-        </w:rPr>
         <w:tab/>
         <w:tab/>
-        <w:t xml:space="preserve">Cửa hàng: </w:t>
-      </w:r>
-      <w:r>
-        <w:rPr>
-          <w:rFonts w:ascii="Times New Roman" w:hAnsi="Times New Roman"/>
-          <w:b/>
-          <w:bCs/>
-          <w:color w:val="231F20"/>
-          <w:w w:val="110"/>
-          <w:sz w:val="24"/>
-          <w:szCs w:val="24"/>
-        </w:rPr>
-        <w:t>Shop Xã Đàn</w:t>
-      </w:r>
-      <w:r>
-        <w:rPr>
-          <w:rFonts w:ascii="Times New Roman" w:hAnsi="Times New Roman"/>
-          <w:color w:val="231F20"/>
-          <w:w w:val="110"/>
-          <w:sz w:val="18"/>
-          <w:szCs w:val="18"/>
-        </w:rPr>
-        <w:t xml:space="preserve"> ....................................................</w:t>
+        <w:t>Cửa hàng: Shop Xã Đàn</w:t>
       </w:r>
     </w:p>
     <w:p>
@@ -1945,7 +1895,7 @@
         </w:rPr>
         <w:tab/>
         <w:tab/>
-        <w:t>Địa chỉ: ..........................................................................................</w:t>
+        <w:t>Địa chỉ:</w:t>
       </w:r>
     </w:p>
     <w:p>
@@ -1970,7 +1920,7 @@
         </w:rPr>
         <w:tab/>
         <w:tab/>
-        <w:t>Điện thoại: .....................................................................................</w:t>
+        <w:t>Điện thoại:</w:t>
       </w:r>
     </w:p>
     <w:p>
@@ -2246,11 +2196,15 @@
     <w:p>
       <w:pPr>
         <w:sectPr>
-          <w:headerReference w:type="default" r:id="rId6"/>
-          <w:footerReference w:type="default" r:id="rId7"/>
+          <w:headerReference w:type="even" r:id="rId2"/>
+          <w:headerReference w:type="default" r:id="rId3"/>
+          <w:headerReference w:type="first" r:id="rId4"/>
+          <w:footerReference w:type="even" r:id="rId5"/>
+          <w:footerReference w:type="default" r:id="rId6"/>
+          <w:footerReference w:type="first" r:id="rId7"/>
           <w:type w:val="nextPage"/>
           <w:pgSz w:w="11906" w:h="16838"/>
-          <w:pgMar w:left="708" w:right="708" w:gutter="0" w:header="0" w:top="580" w:footer="0" w:bottom="0"/>
+          <w:pgMar w:left="708" w:right="708" w:gutter="0" w:header="0" w:top="580" w:footer="0" w:bottom="57"/>
           <w:pgNumType w:fmt="decimal"/>
           <w:cols w:num="2" w:equalWidth="false" w:sep="false">
             <w:col w:w="2859" w:space="504"/>
@@ -2297,27 +2251,15 @@
       </w:r>
       <w:r>
         <w:rPr>
-          <w:rFonts w:eastAsia="Calibri" w:cs="Calibri" w:ascii="Times New Roman" w:hAnsi="Times New Roman"/>
-          <w:b/>
+          <w:rFonts w:eastAsia="JetBrainsMono NF ExtraBold" w:cs="JetBrainsMono NF ExtraBold" w:ascii="JetBrainsMono NF ExtraBold" w:hAnsi="JetBrainsMono NF ExtraBold"/>
+          <w:b w:val="0"/>
           <w:color w:val="231F20"/>
           <w:kern w:val="0"/>
-          <w:sz w:val="26"/>
+          <w:sz w:val="24"/>
           <w:szCs w:val="24"/>
           <w:lang w:val="vi-VN" w:eastAsia="en-US" w:bidi="ar-SA"/>
         </w:rPr>
         <w:t>{{ aftersale_customer_name }}</w:t>
-      </w:r>
-      <w:r>
-        <w:rPr>
-          <w:rFonts w:eastAsia="Calibri" w:cs="Calibri" w:ascii="Times New Roman" w:hAnsi="Times New Roman"/>
-          <w:b w:val="0"/>
-          <w:color w:val="231F20"/>
-          <w:kern w:val="0"/>
-          <w:sz w:val="24"/>
-          <w:szCs w:val="24"/>
-          <w:lang w:val="vi-VN" w:eastAsia="en-US" w:bidi="ar-SA"/>
-        </w:rPr>
-        <w:t xml:space="preserve"> .....</w:t>
       </w:r>
     </w:p>
     <w:p>
@@ -2355,6 +2297,30 @@
       </w:r>
       <w:r>
         <w:rPr>
+          <w:rFonts w:eastAsia="JetBrainsMono NF ExtraBold" w:cs="JetBrainsMono NF ExtraBold" w:ascii="JetBrainsMono NF ExtraBold" w:hAnsi="JetBrainsMono NF ExtraBold"/>
+          <w:b w:val="0"/>
+          <w:color w:val="231F20"/>
+          <w:kern w:val="0"/>
+          <w:sz w:val="24"/>
+          <w:szCs w:val="24"/>
+          <w:lang w:val="vi-VN" w:eastAsia="en-US" w:bidi="ar-SA"/>
+        </w:rPr>
+        <w:t>{{ aftersale_customer_id_number }}</w:t>
+      </w:r>
+      <w:r>
+        <w:rPr>
+          <w:rFonts w:eastAsia="Calibri" w:cs="Calibri" w:ascii="Times New Roman" w:hAnsi="Times New Roman"/>
+          <w:b w:val="false"/>
+          <w:color w:val="231F20"/>
+          <w:kern w:val="0"/>
+          <w:sz w:val="24"/>
+          <w:szCs w:val="24"/>
+          <w:lang w:val="vi-VN" w:eastAsia="en-US" w:bidi="ar-SA"/>
+        </w:rPr>
+        <w:t xml:space="preserve"> Ngày cấp: </w:t>
+      </w:r>
+      <w:r>
+        <w:rPr>
           <w:rFonts w:eastAsia="Calibri" w:cs="Calibri" w:ascii="Times New Roman" w:hAnsi="Times New Roman"/>
           <w:b/>
           <w:color w:val="231F20"/>
@@ -2363,11 +2329,23 @@
           <w:szCs w:val="24"/>
           <w:lang w:val="vi-VN" w:eastAsia="en-US" w:bidi="ar-SA"/>
         </w:rPr>
-        <w:t>{{ aftersale_customer_id_number }}</w:t>
+        <w:t>{{ aftersale_customer_issue_date }}</w:t>
       </w:r>
       <w:r>
         <w:rPr>
           <w:rFonts w:eastAsia="Calibri" w:cs="Calibri" w:ascii="Times New Roman" w:hAnsi="Times New Roman"/>
+          <w:b w:val="false"/>
+          <w:color w:val="231F20"/>
+          <w:kern w:val="0"/>
+          <w:sz w:val="24"/>
+          <w:szCs w:val="24"/>
+          <w:lang w:val="vi-VN" w:eastAsia="en-US" w:bidi="ar-SA"/>
+        </w:rPr>
+        <w:t xml:space="preserve"> Nơi cấp: </w:t>
+      </w:r>
+      <w:r>
+        <w:rPr>
+          <w:rFonts w:eastAsia="JetBrainsMono NF ExtraBold" w:cs="JetBrainsMono NF ExtraBold" w:ascii="JetBrainsMono NF ExtraBold" w:hAnsi="JetBrainsMono NF ExtraBold"/>
           <w:b w:val="0"/>
           <w:color w:val="231F20"/>
           <w:kern w:val="0"/>
@@ -2375,79 +2353,7 @@
           <w:szCs w:val="24"/>
           <w:lang w:val="vi-VN" w:eastAsia="en-US" w:bidi="ar-SA"/>
         </w:rPr>
-        <w:t xml:space="preserve"> .....</w:t>
-      </w:r>
-      <w:r>
-        <w:rPr>
-          <w:rFonts w:eastAsia="Calibri" w:cs="Calibri" w:ascii="Times New Roman" w:hAnsi="Times New Roman"/>
-          <w:b w:val="0"/>
-          <w:color w:val="231F20"/>
-          <w:kern w:val="0"/>
-          <w:sz w:val="24"/>
-          <w:szCs w:val="24"/>
-          <w:lang w:val="vi-VN" w:eastAsia="en-US" w:bidi="ar-SA"/>
-        </w:rPr>
-        <w:t xml:space="preserve">.   Ngày cấp: </w:t>
-      </w:r>
-      <w:r>
-        <w:rPr>
-          <w:rFonts w:eastAsia="Calibri" w:cs="Calibri" w:ascii="Times New Roman" w:hAnsi="Times New Roman"/>
-          <w:b/>
-          <w:color w:val="231F20"/>
-          <w:kern w:val="0"/>
-          <w:sz w:val="26"/>
-          <w:szCs w:val="24"/>
-          <w:lang w:val="vi-VN" w:eastAsia="en-US" w:bidi="ar-SA"/>
-        </w:rPr>
-        <w:t>{{ aftersale_customer_issue_date }}</w:t>
-      </w:r>
-      <w:r>
-        <w:rPr>
-          <w:rFonts w:eastAsia="Calibri" w:cs="Calibri" w:ascii="Times New Roman" w:hAnsi="Times New Roman"/>
-          <w:b w:val="0"/>
-          <w:color w:val="231F20"/>
-          <w:kern w:val="0"/>
-          <w:sz w:val="24"/>
-          <w:szCs w:val="24"/>
-          <w:lang w:val="vi-VN" w:eastAsia="en-US" w:bidi="ar-SA"/>
-        </w:rPr>
-        <w:t xml:space="preserve"> .....</w:t>
-      </w:r>
-      <w:r>
-        <w:rPr>
-          <w:rFonts w:eastAsia="Calibri" w:cs="Calibri" w:ascii="Times New Roman" w:hAnsi="Times New Roman"/>
-          <w:b w:val="0"/>
-          <w:color w:val="231F20"/>
-          <w:kern w:val="0"/>
-          <w:sz w:val="24"/>
-          <w:szCs w:val="24"/>
-          <w:lang w:val="vi-VN" w:eastAsia="en-US" w:bidi="ar-SA"/>
-        </w:rPr>
-        <w:t xml:space="preserve">.    Nơi cấp: </w:t>
-      </w:r>
-      <w:r>
-        <w:rPr>
-          <w:rFonts w:eastAsia="Calibri" w:cs="Calibri" w:ascii="Times New Roman" w:hAnsi="Times New Roman"/>
-          <w:b/>
-          <w:color w:val="231F20"/>
-          <w:kern w:val="0"/>
-          <w:sz w:val="26"/>
-          <w:szCs w:val="24"/>
-          <w:lang w:val="vi-VN" w:eastAsia="en-US" w:bidi="ar-SA"/>
-        </w:rPr>
         <w:t>{{ aftersale_customer_issue_place }}</w:t>
-      </w:r>
-      <w:r>
-        <w:rPr>
-          <w:rFonts w:eastAsia="Calibri" w:cs="Calibri" w:ascii="Times New Roman" w:hAnsi="Times New Roman"/>
-          <w:b w:val="0"/>
-          <w:color w:val="231F20"/>
-          <w:kern w:val="0"/>
-          <w:sz w:val="24"/>
-          <w:szCs w:val="24"/>
-          <w:lang w:val="vi-VN" w:eastAsia="en-US" w:bidi="ar-SA"/>
-        </w:rPr>
-        <w:t xml:space="preserve"> .....</w:t>
       </w:r>
     </w:p>
     <w:p>
@@ -2485,27 +2391,15 @@
       </w:r>
       <w:r>
         <w:rPr>
-          <w:rFonts w:eastAsia="Calibri" w:cs="Calibri" w:ascii="Times New Roman" w:hAnsi="Times New Roman"/>
-          <w:b/>
+          <w:rFonts w:eastAsia="JetBrainsMono NF ExtraBold" w:cs="JetBrainsMono NF ExtraBold" w:ascii="JetBrainsMono NF ExtraBold" w:hAnsi="JetBrainsMono NF ExtraBold"/>
+          <w:b w:val="0"/>
           <w:color w:val="231F20"/>
           <w:kern w:val="0"/>
-          <w:sz w:val="26"/>
+          <w:sz w:val="24"/>
           <w:szCs w:val="24"/>
           <w:lang w:val="vi-VN" w:eastAsia="en-US" w:bidi="ar-SA"/>
         </w:rPr>
         <w:t>{{ aftersale_customer_address }}</w:t>
-      </w:r>
-      <w:r>
-        <w:rPr>
-          <w:rFonts w:eastAsia="Calibri" w:cs="Calibri" w:ascii="Times New Roman" w:hAnsi="Times New Roman"/>
-          <w:b w:val="0"/>
-          <w:color w:val="231F20"/>
-          <w:kern w:val="0"/>
-          <w:sz w:val="24"/>
-          <w:szCs w:val="24"/>
-          <w:lang w:val="vi-VN" w:eastAsia="en-US" w:bidi="ar-SA"/>
-        </w:rPr>
-        <w:t xml:space="preserve"> .....</w:t>
       </w:r>
     </w:p>
     <w:p>
@@ -2543,27 +2437,15 @@
       </w:r>
       <w:r>
         <w:rPr>
-          <w:rFonts w:eastAsia="Calibri" w:cs="Calibri" w:ascii="Times New Roman" w:hAnsi="Times New Roman"/>
-          <w:b/>
+          <w:rFonts w:eastAsia="JetBrainsMono NF ExtraBold" w:cs="JetBrainsMono NF ExtraBold" w:ascii="JetBrainsMono NF ExtraBold" w:hAnsi="JetBrainsMono NF ExtraBold"/>
+          <w:b w:val="0"/>
           <w:color w:val="231F20"/>
           <w:kern w:val="0"/>
-          <w:sz w:val="26"/>
+          <w:sz w:val="24"/>
           <w:szCs w:val="24"/>
           <w:lang w:val="vi-VN" w:eastAsia="en-US" w:bidi="ar-SA"/>
         </w:rPr>
         <w:t>{{ aftersale_customer_phone }}</w:t>
-      </w:r>
-      <w:r>
-        <w:rPr>
-          <w:rFonts w:eastAsia="Calibri" w:cs="Calibri" w:ascii="Times New Roman" w:hAnsi="Times New Roman"/>
-          <w:b w:val="0"/>
-          <w:color w:val="231F20"/>
-          <w:kern w:val="0"/>
-          <w:sz w:val="24"/>
-          <w:szCs w:val="24"/>
-          <w:lang w:val="vi-VN" w:eastAsia="en-US" w:bidi="ar-SA"/>
-        </w:rPr>
-        <w:t xml:space="preserve"> .....</w:t>
       </w:r>
     </w:p>
     <w:p>
@@ -2671,27 +2553,15 @@
       </w:r>
       <w:r>
         <w:rPr>
-          <w:rFonts w:eastAsia="Calibri" w:cs="Calibri" w:ascii="Times New Roman" w:hAnsi="Times New Roman"/>
-          <w:b/>
+          <w:rFonts w:eastAsia="JetBrainsMono NF ExtraBold" w:cs="JetBrainsMono NF ExtraBold" w:ascii="JetBrainsMono NF ExtraBold" w:hAnsi="JetBrainsMono NF ExtraBold"/>
+          <w:b w:val="0"/>
           <w:color w:val="231F20"/>
           <w:kern w:val="0"/>
-          <w:sz w:val="26"/>
+          <w:sz w:val="24"/>
           <w:szCs w:val="24"/>
           <w:lang w:val="vi-VN" w:eastAsia="en-US" w:bidi="ar-SA"/>
         </w:rPr>
         <w:t>{{ other_attachment_value }}</w:t>
-      </w:r>
-      <w:r>
-        <w:rPr>
-          <w:rFonts w:eastAsia="Calibri" w:cs="Calibri" w:ascii="Times New Roman" w:hAnsi="Times New Roman"/>
-          <w:b w:val="0"/>
-          <w:color w:val="231F20"/>
-          <w:kern w:val="0"/>
-          <w:sz w:val="24"/>
-          <w:szCs w:val="24"/>
-          <w:lang w:val="vi-VN" w:eastAsia="en-US" w:bidi="ar-SA"/>
-        </w:rPr>
-        <w:t xml:space="preserve"> .....</w:t>
       </w:r>
     </w:p>
     <w:p>
@@ -3202,32 +3072,20 @@
       </w:r>
       <w:r>
         <w:rPr>
+          <w:rFonts w:eastAsia="JetBrainsMono NF ExtraBold" w:cs="JetBrainsMono NF ExtraBold" w:ascii="JetBrainsMono NF ExtraBold" w:hAnsi="JetBrainsMono NF ExtraBold"/>
+          <w:b w:val="0"/>
+          <w:color w:val="231F20"/>
+          <w:kern w:val="0"/>
+          <w:sz w:val="24"/>
+          <w:szCs w:val="24"/>
+          <w:lang w:val="vi-VN" w:eastAsia="en-US" w:bidi="ar-SA"/>
+        </w:rPr>
+        <w:t>{{ update_subscriber_number }}</w:t>
+      </w:r>
+      <w:r>
+        <w:rPr>
           <w:rFonts w:eastAsia="Calibri" w:cs="Calibri" w:ascii="Times New Roman" w:hAnsi="Times New Roman"/>
-          <w:b/>
-          <w:color w:val="231F20"/>
-          <w:kern w:val="0"/>
-          <w:sz w:val="26"/>
-          <w:szCs w:val="24"/>
-          <w:lang w:val="vi-VN" w:eastAsia="en-US" w:bidi="ar-SA"/>
-        </w:rPr>
-        <w:t>{{ update_subscriber_number }}</w:t>
-      </w:r>
-      <w:r>
-        <w:rPr>
-          <w:rFonts w:eastAsia="Calibri" w:cs="Calibri" w:ascii="Times New Roman" w:hAnsi="Times New Roman"/>
-          <w:b w:val="0"/>
-          <w:color w:val="231F20"/>
-          <w:kern w:val="0"/>
-          <w:sz w:val="24"/>
-          <w:szCs w:val="24"/>
-          <w:lang w:val="vi-VN" w:eastAsia="en-US" w:bidi="ar-SA"/>
-        </w:rPr>
-        <w:t xml:space="preserve"> .....</w:t>
-      </w:r>
-      <w:r>
-        <w:rPr>
-          <w:rFonts w:eastAsia="Calibri" w:cs="Calibri" w:ascii="Times New Roman" w:hAnsi="Times New Roman"/>
-          <w:b w:val="0"/>
+          <w:b w:val="false"/>
           <w:color w:val="231F20"/>
           <w:kern w:val="0"/>
           <w:sz w:val="24"/>
@@ -3313,32 +3171,20 @@
       </w:r>
       <w:r>
         <w:rPr>
+          <w:rFonts w:eastAsia="JetBrainsMono NF ExtraBold" w:cs="JetBrainsMono NF ExtraBold" w:ascii="JetBrainsMono NF ExtraBold" w:hAnsi="JetBrainsMono NF ExtraBold"/>
+          <w:b w:val="0"/>
+          <w:color w:val="231F20"/>
+          <w:kern w:val="0"/>
+          <w:sz w:val="24"/>
+          <w:szCs w:val="24"/>
+          <w:lang w:val="vi-VN" w:eastAsia="en-US" w:bidi="ar-SA"/>
+        </w:rPr>
+        <w:t>{{ replace_sim_subscriber_number }}</w:t>
+      </w:r>
+      <w:r>
+        <w:rPr>
           <w:rFonts w:eastAsia="Calibri" w:cs="Calibri" w:ascii="Times New Roman" w:hAnsi="Times New Roman"/>
-          <w:b/>
-          <w:color w:val="231F20"/>
-          <w:kern w:val="0"/>
-          <w:sz w:val="26"/>
-          <w:szCs w:val="24"/>
-          <w:lang w:val="vi-VN" w:eastAsia="en-US" w:bidi="ar-SA"/>
-        </w:rPr>
-        <w:t>{{ replace_sim_subscriber_number }}</w:t>
-      </w:r>
-      <w:r>
-        <w:rPr>
-          <w:rFonts w:eastAsia="Calibri" w:cs="Calibri" w:ascii="Times New Roman" w:hAnsi="Times New Roman"/>
-          <w:b w:val="0"/>
-          <w:color w:val="231F20"/>
-          <w:kern w:val="0"/>
-          <w:sz w:val="24"/>
-          <w:szCs w:val="24"/>
-          <w:lang w:val="vi-VN" w:eastAsia="en-US" w:bidi="ar-SA"/>
-        </w:rPr>
-        <w:t xml:space="preserve"> .....</w:t>
-      </w:r>
-      <w:r>
-        <w:rPr>
-          <w:rFonts w:eastAsia="Calibri" w:cs="Calibri" w:ascii="Times New Roman" w:hAnsi="Times New Roman"/>
-          <w:b w:val="0"/>
+          <w:b w:val="false"/>
           <w:color w:val="231F20"/>
           <w:kern w:val="0"/>
           <w:sz w:val="24"/>
@@ -3424,7 +3270,31 @@
       </w:r>
       <w:r>
         <w:rPr>
+          <w:rFonts w:eastAsia="JetBrainsMono NF ExtraBold" w:cs="JetBrainsMono NF ExtraBold" w:ascii="JetBrainsMono NF ExtraBold" w:hAnsi="JetBrainsMono NF ExtraBold"/>
+          <w:b w:val="0"/>
+          <w:color w:val="231F20"/>
+          <w:kern w:val="0"/>
+          <w:sz w:val="24"/>
+          <w:szCs w:val="24"/>
+          <w:lang w:val="vi-VN" w:eastAsia="en-US" w:bidi="ar-SA"/>
+        </w:rPr>
+        <w:t>{{ transfer_subscriber_number }}</w:t>
+      </w:r>
+      <w:r>
+        <w:rPr>
           <w:rFonts w:eastAsia="Calibri" w:cs="Calibri" w:ascii="Times New Roman" w:hAnsi="Times New Roman"/>
+          <w:b w:val="false"/>
+          <w:color w:val="231F20"/>
+          <w:kern w:val="0"/>
+          <w:sz w:val="24"/>
+          <w:szCs w:val="24"/>
+          <w:lang w:val="vi-VN" w:eastAsia="en-US" w:bidi="ar-SA"/>
+        </w:rPr>
+        <w:t xml:space="preserve"> và chuyển quyền sử dụng số thuê bao này và dịch vụ điện thoại di động trả trước cho Ông/Bà </w:t>
+      </w:r>
+      <w:r>
+        <w:rPr>
+          <w:rFonts w:eastAsia="JetBrainsMono NF ExtraBold" w:cs="JetBrainsMono NF ExtraBold" w:ascii="JetBrainsMono NF ExtraBold" w:hAnsi="JetBrainsMono NF ExtraBold"/>
           <w:b w:val="0"/>
           <w:color w:val="231F20"/>
           <w:kern w:val="0"/>
@@ -3432,7 +3302,43 @@
           <w:szCs w:val="24"/>
           <w:lang w:val="vi-VN" w:eastAsia="en-US" w:bidi="ar-SA"/>
         </w:rPr>
-        <w:t xml:space="preserve">..... </w:t>
+        <w:t>{{ transfer_new_owner_name }}</w:t>
+      </w:r>
+      <w:r>
+        <w:rPr>
+          <w:rFonts w:eastAsia="Calibri" w:cs="Calibri" w:ascii="Times New Roman" w:hAnsi="Times New Roman"/>
+          <w:b w:val="false"/>
+          <w:color w:val="231F20"/>
+          <w:kern w:val="0"/>
+          <w:sz w:val="24"/>
+          <w:szCs w:val="24"/>
+          <w:lang w:val="vi-VN" w:eastAsia="en-US" w:bidi="ar-SA"/>
+        </w:rPr>
+        <w:t xml:space="preserve">, số CMND/CCCD </w:t>
+      </w:r>
+      <w:r>
+        <w:rPr>
+          <w:rFonts w:eastAsia="JetBrainsMono NF ExtraBold" w:cs="JetBrainsMono NF ExtraBold" w:ascii="JetBrainsMono NF ExtraBold" w:hAnsi="JetBrainsMono NF ExtraBold"/>
+          <w:b w:val="0"/>
+          <w:color w:val="231F20"/>
+          <w:kern w:val="0"/>
+          <w:sz w:val="24"/>
+          <w:szCs w:val="24"/>
+          <w:lang w:val="vi-VN" w:eastAsia="en-US" w:bidi="ar-SA"/>
+        </w:rPr>
+        <w:t>{{ transfer_new_owner_id_number }}</w:t>
+      </w:r>
+      <w:r>
+        <w:rPr>
+          <w:rFonts w:eastAsia="Calibri" w:cs="Calibri" w:ascii="Times New Roman" w:hAnsi="Times New Roman"/>
+          <w:b w:val="false"/>
+          <w:color w:val="231F20"/>
+          <w:kern w:val="0"/>
+          <w:sz w:val="24"/>
+          <w:szCs w:val="24"/>
+          <w:lang w:val="vi-VN" w:eastAsia="en-US" w:bidi="ar-SA"/>
+        </w:rPr>
+        <w:t xml:space="preserve">, ngày cấp </w:t>
       </w:r>
       <w:r>
         <w:rPr>
@@ -3444,11 +3350,23 @@
           <w:szCs w:val="24"/>
           <w:lang w:val="vi-VN" w:eastAsia="en-US" w:bidi="ar-SA"/>
         </w:rPr>
-        <w:t>{{ transfer_subscriber_number }}</w:t>
+        <w:t>{{ transfer_new_owner_issue_date }}</w:t>
       </w:r>
       <w:r>
         <w:rPr>
           <w:rFonts w:eastAsia="Calibri" w:cs="Calibri" w:ascii="Times New Roman" w:hAnsi="Times New Roman"/>
+          <w:b w:val="false"/>
+          <w:color w:val="231F20"/>
+          <w:kern w:val="0"/>
+          <w:sz w:val="24"/>
+          <w:szCs w:val="24"/>
+          <w:lang w:val="vi-VN" w:eastAsia="en-US" w:bidi="ar-SA"/>
+        </w:rPr>
+        <w:t xml:space="preserve">, nơi cấp </w:t>
+      </w:r>
+      <w:r>
+        <w:rPr>
+          <w:rFonts w:eastAsia="JetBrainsMono NF ExtraBold" w:cs="JetBrainsMono NF ExtraBold" w:ascii="JetBrainsMono NF ExtraBold" w:hAnsi="JetBrainsMono NF ExtraBold"/>
           <w:b w:val="0"/>
           <w:color w:val="231F20"/>
           <w:kern w:val="0"/>
@@ -3456,204 +3374,12 @@
           <w:szCs w:val="24"/>
           <w:lang w:val="vi-VN" w:eastAsia="en-US" w:bidi="ar-SA"/>
         </w:rPr>
-        <w:t xml:space="preserve"> .....</w:t>
+        <w:t>{{ transfer_new_owner_issue_place }}</w:t>
       </w:r>
       <w:r>
         <w:rPr>
           <w:rFonts w:eastAsia="Calibri" w:cs="Calibri" w:ascii="Times New Roman" w:hAnsi="Times New Roman"/>
-          <w:b w:val="0"/>
-          <w:color w:val="231F20"/>
-          <w:kern w:val="0"/>
-          <w:sz w:val="24"/>
-          <w:szCs w:val="24"/>
-          <w:lang w:val="vi-VN" w:eastAsia="en-US" w:bidi="ar-SA"/>
-        </w:rPr>
-        <w:t xml:space="preserve"> và chuyển quyền sử dụng số thuê bao này và dịch vụ điện thoại di động trả trước cho Ông/Bà </w:t>
-      </w:r>
-      <w:r>
-        <w:rPr>
-          <w:rFonts w:eastAsia="Calibri" w:cs="Calibri" w:ascii="Times New Roman" w:hAnsi="Times New Roman"/>
-          <w:b w:val="0"/>
-          <w:color w:val="231F20"/>
-          <w:kern w:val="0"/>
-          <w:sz w:val="24"/>
-          <w:szCs w:val="24"/>
-          <w:lang w:val="vi-VN" w:eastAsia="en-US" w:bidi="ar-SA"/>
-        </w:rPr>
-        <w:t xml:space="preserve">..... </w:t>
-      </w:r>
-      <w:r>
-        <w:rPr>
-          <w:rFonts w:eastAsia="Calibri" w:cs="Calibri" w:ascii="Times New Roman" w:hAnsi="Times New Roman"/>
-          <w:b/>
-          <w:color w:val="231F20"/>
-          <w:kern w:val="0"/>
-          <w:sz w:val="26"/>
-          <w:szCs w:val="24"/>
-          <w:lang w:val="vi-VN" w:eastAsia="en-US" w:bidi="ar-SA"/>
-        </w:rPr>
-        <w:t>{{ transfer_new_owner_name }}</w:t>
-      </w:r>
-      <w:r>
-        <w:rPr>
-          <w:rFonts w:eastAsia="Calibri" w:cs="Calibri" w:ascii="Times New Roman" w:hAnsi="Times New Roman"/>
-          <w:b w:val="0"/>
-          <w:color w:val="231F20"/>
-          <w:kern w:val="0"/>
-          <w:sz w:val="24"/>
-          <w:szCs w:val="24"/>
-          <w:lang w:val="vi-VN" w:eastAsia="en-US" w:bidi="ar-SA"/>
-        </w:rPr>
-        <w:t xml:space="preserve"> .....</w:t>
-      </w:r>
-      <w:r>
-        <w:rPr>
-          <w:rFonts w:eastAsia="Calibri" w:cs="Calibri" w:ascii="Times New Roman" w:hAnsi="Times New Roman"/>
-          <w:b w:val="0"/>
-          <w:color w:val="231F20"/>
-          <w:kern w:val="0"/>
-          <w:sz w:val="24"/>
-          <w:szCs w:val="24"/>
-          <w:lang w:val="vi-VN" w:eastAsia="en-US" w:bidi="ar-SA"/>
-        </w:rPr>
-        <w:t xml:space="preserve">, số CMND/CCCD </w:t>
-      </w:r>
-      <w:r>
-        <w:rPr>
-          <w:rFonts w:eastAsia="Calibri" w:cs="Calibri" w:ascii="Times New Roman" w:hAnsi="Times New Roman"/>
-          <w:b w:val="0"/>
-          <w:color w:val="231F20"/>
-          <w:kern w:val="0"/>
-          <w:sz w:val="24"/>
-          <w:szCs w:val="24"/>
-          <w:lang w:val="vi-VN" w:eastAsia="en-US" w:bidi="ar-SA"/>
-        </w:rPr>
-        <w:t xml:space="preserve">..... </w:t>
-      </w:r>
-      <w:r>
-        <w:rPr>
-          <w:rFonts w:eastAsia="Calibri" w:cs="Calibri" w:ascii="Times New Roman" w:hAnsi="Times New Roman"/>
-          <w:b/>
-          <w:color w:val="231F20"/>
-          <w:kern w:val="0"/>
-          <w:sz w:val="26"/>
-          <w:szCs w:val="24"/>
-          <w:lang w:val="vi-VN" w:eastAsia="en-US" w:bidi="ar-SA"/>
-        </w:rPr>
-        <w:t>{{ transfer_new_owner_id_number }}</w:t>
-      </w:r>
-      <w:r>
-        <w:rPr>
-          <w:rFonts w:eastAsia="Calibri" w:cs="Calibri" w:ascii="Times New Roman" w:hAnsi="Times New Roman"/>
-          <w:b w:val="0"/>
-          <w:color w:val="231F20"/>
-          <w:kern w:val="0"/>
-          <w:sz w:val="24"/>
-          <w:szCs w:val="24"/>
-          <w:lang w:val="vi-VN" w:eastAsia="en-US" w:bidi="ar-SA"/>
-        </w:rPr>
-        <w:t xml:space="preserve"> .....</w:t>
-      </w:r>
-      <w:r>
-        <w:rPr>
-          <w:rFonts w:eastAsia="Calibri" w:cs="Calibri" w:ascii="Times New Roman" w:hAnsi="Times New Roman"/>
-          <w:b w:val="0"/>
-          <w:color w:val="231F20"/>
-          <w:kern w:val="0"/>
-          <w:sz w:val="24"/>
-          <w:szCs w:val="24"/>
-          <w:lang w:val="vi-VN" w:eastAsia="en-US" w:bidi="ar-SA"/>
-        </w:rPr>
-        <w:t xml:space="preserve">, ngày cấp </w:t>
-      </w:r>
-      <w:r>
-        <w:rPr>
-          <w:rFonts w:eastAsia="Calibri" w:cs="Calibri" w:ascii="Times New Roman" w:hAnsi="Times New Roman"/>
-          <w:b w:val="0"/>
-          <w:color w:val="231F20"/>
-          <w:kern w:val="0"/>
-          <w:sz w:val="24"/>
-          <w:szCs w:val="24"/>
-          <w:lang w:val="vi-VN" w:eastAsia="en-US" w:bidi="ar-SA"/>
-        </w:rPr>
-        <w:t xml:space="preserve">..... </w:t>
-      </w:r>
-      <w:r>
-        <w:rPr>
-          <w:rFonts w:eastAsia="Calibri" w:cs="Calibri" w:ascii="Times New Roman" w:hAnsi="Times New Roman"/>
-          <w:b/>
-          <w:color w:val="231F20"/>
-          <w:kern w:val="0"/>
-          <w:sz w:val="26"/>
-          <w:szCs w:val="24"/>
-          <w:lang w:val="vi-VN" w:eastAsia="en-US" w:bidi="ar-SA"/>
-        </w:rPr>
-        <w:t>{{ transfer_new_owner_issue_date }}</w:t>
-      </w:r>
-      <w:r>
-        <w:rPr>
-          <w:rFonts w:eastAsia="Calibri" w:cs="Calibri" w:ascii="Times New Roman" w:hAnsi="Times New Roman"/>
-          <w:b w:val="0"/>
-          <w:color w:val="231F20"/>
-          <w:kern w:val="0"/>
-          <w:sz w:val="24"/>
-          <w:szCs w:val="24"/>
-          <w:lang w:val="vi-VN" w:eastAsia="en-US" w:bidi="ar-SA"/>
-        </w:rPr>
-        <w:t xml:space="preserve"> .....</w:t>
-      </w:r>
-      <w:r>
-        <w:rPr>
-          <w:rFonts w:eastAsia="Calibri" w:cs="Calibri" w:ascii="Times New Roman" w:hAnsi="Times New Roman"/>
-          <w:b w:val="0"/>
-          <w:color w:val="231F20"/>
-          <w:kern w:val="0"/>
-          <w:sz w:val="24"/>
-          <w:szCs w:val="24"/>
-          <w:lang w:val="vi-VN" w:eastAsia="en-US" w:bidi="ar-SA"/>
-        </w:rPr>
-        <w:t xml:space="preserve">, nơi cấp </w:t>
-      </w:r>
-      <w:r>
-        <w:rPr>
-          <w:rFonts w:eastAsia="Calibri" w:cs="Calibri" w:ascii="Times New Roman" w:hAnsi="Times New Roman"/>
-          <w:b w:val="0"/>
-          <w:color w:val="231F20"/>
-          <w:kern w:val="0"/>
-          <w:sz w:val="24"/>
-          <w:szCs w:val="24"/>
-          <w:lang w:val="vi-VN" w:eastAsia="en-US" w:bidi="ar-SA"/>
-        </w:rPr>
-        <w:t xml:space="preserve">..... </w:t>
-      </w:r>
-      <w:r>
-        <w:rPr>
-          <w:rFonts w:eastAsia="Calibri" w:cs="Calibri" w:ascii="Times New Roman" w:hAnsi="Times New Roman"/>
-          <w:b/>
-          <w:color w:val="231F20"/>
-          <w:kern w:val="0"/>
-          <w:sz w:val="26"/>
-          <w:szCs w:val="24"/>
-          <w:lang w:val="vi-VN" w:eastAsia="en-US" w:bidi="ar-SA"/>
-        </w:rPr>
-        <w:t>{{ transfer_new_owner_issue_place }}</w:t>
-      </w:r>
-      <w:r>
-        <w:rPr>
-          <w:rFonts w:eastAsia="Calibri" w:cs="Calibri" w:ascii="Times New Roman" w:hAnsi="Times New Roman"/>
-          <w:b w:val="0"/>
-          <w:color w:val="231F20"/>
-          <w:kern w:val="0"/>
-          <w:sz w:val="24"/>
-          <w:szCs w:val="24"/>
-          <w:lang w:val="vi-VN" w:eastAsia="en-US" w:bidi="ar-SA"/>
-        </w:rPr>
-        <w:t xml:space="preserve"> .....</w:t>
-      </w:r>
-      <w:r>
-        <w:rPr>
-          <w:rFonts w:eastAsia="Calibri" w:cs="Calibri" w:ascii="Times New Roman" w:hAnsi="Times New Roman"/>
-          <w:b w:val="0"/>
+          <w:b w:val="false"/>
           <w:color w:val="231F20"/>
           <w:kern w:val="0"/>
           <w:sz w:val="24"/>
@@ -3952,44 +3678,20 @@
       </w:r>
       <w:r>
         <w:rPr>
+          <w:rFonts w:eastAsia="JetBrainsMono NF ExtraBold" w:cs="JetBrainsMono NF ExtraBold" w:ascii="JetBrainsMono NF ExtraBold" w:hAnsi="JetBrainsMono NF ExtraBold"/>
+          <w:b w:val="0"/>
+          <w:color w:val="231F20"/>
+          <w:kern w:val="0"/>
+          <w:sz w:val="24"/>
+          <w:szCs w:val="24"/>
+          <w:lang w:val="vi-VN" w:eastAsia="en-US" w:bidi="ar-SA"/>
+        </w:rPr>
+        <w:t>{{ common_subscriber_number }}</w:t>
+      </w:r>
+      <w:r>
+        <w:rPr>
           <w:rFonts w:eastAsia="Calibri" w:cs="Calibri" w:ascii="Times New Roman" w:hAnsi="Times New Roman"/>
-          <w:b w:val="0"/>
-          <w:color w:val="231F20"/>
-          <w:kern w:val="0"/>
-          <w:sz w:val="24"/>
-          <w:szCs w:val="24"/>
-          <w:lang w:val="vi-VN" w:eastAsia="en-US" w:bidi="ar-SA"/>
-        </w:rPr>
-        <w:t xml:space="preserve">..... </w:t>
-      </w:r>
-      <w:r>
-        <w:rPr>
-          <w:rFonts w:eastAsia="Calibri" w:cs="Calibri" w:ascii="Times New Roman" w:hAnsi="Times New Roman"/>
-          <w:b/>
-          <w:color w:val="231F20"/>
-          <w:kern w:val="0"/>
-          <w:sz w:val="26"/>
-          <w:szCs w:val="24"/>
-          <w:lang w:val="vi-VN" w:eastAsia="en-US" w:bidi="ar-SA"/>
-        </w:rPr>
-        <w:t>{{ common_subscriber_number }}</w:t>
-      </w:r>
-      <w:r>
-        <w:rPr>
-          <w:rFonts w:eastAsia="Calibri" w:cs="Calibri" w:ascii="Times New Roman" w:hAnsi="Times New Roman"/>
-          <w:b w:val="0"/>
-          <w:color w:val="231F20"/>
-          <w:kern w:val="0"/>
-          <w:sz w:val="24"/>
-          <w:szCs w:val="24"/>
-          <w:lang w:val="vi-VN" w:eastAsia="en-US" w:bidi="ar-SA"/>
-        </w:rPr>
-        <w:t xml:space="preserve"> .....</w:t>
-      </w:r>
-      <w:r>
-        <w:rPr>
-          <w:rFonts w:eastAsia="Calibri" w:cs="Calibri" w:ascii="Times New Roman" w:hAnsi="Times New Roman"/>
-          <w:b w:val="0"/>
+          <w:b w:val="false"/>
           <w:color w:val="231F20"/>
           <w:kern w:val="0"/>
           <w:sz w:val="24"/>
@@ -4586,68 +4288,44 @@
       </w:r>
       <w:r>
         <w:rPr>
+          <w:rFonts w:eastAsia="JetBrainsMono NF ExtraBold" w:cs="JetBrainsMono NF ExtraBold" w:ascii="JetBrainsMono NF ExtraBold" w:hAnsi="JetBrainsMono NF ExtraBold"/>
+          <w:b w:val="0"/>
+          <w:color w:val="231F20"/>
+          <w:kern w:val="0"/>
+          <w:sz w:val="24"/>
+          <w:szCs w:val="24"/>
+          <w:lang w:val="vi-VN" w:eastAsia="en-US" w:bidi="ar-SA"/>
+        </w:rPr>
+        <w:t>{{ backup_phone_1_line }}</w:t>
+      </w:r>
+      <w:r>
+        <w:rPr>
           <w:rFonts w:eastAsia="Calibri" w:cs="Calibri" w:ascii="Times New Roman" w:hAnsi="Times New Roman"/>
-          <w:b/>
+          <w:b w:val="false"/>
           <w:color w:val="231F20"/>
           <w:kern w:val="0"/>
-          <w:sz w:val="26"/>
+          <w:sz w:val="24"/>
           <w:szCs w:val="24"/>
           <w:lang w:val="vi-VN" w:eastAsia="en-US" w:bidi="ar-SA"/>
         </w:rPr>
-        <w:t>{{ backup_phone_1_line }}</w:t>
+        <w:t xml:space="preserve"> hoặc số điện thoại 2: </w:t>
+      </w:r>
+      <w:r>
+        <w:rPr>
+          <w:rFonts w:eastAsia="JetBrainsMono NF ExtraBold" w:cs="JetBrainsMono NF ExtraBold" w:ascii="JetBrainsMono NF ExtraBold" w:hAnsi="JetBrainsMono NF ExtraBold"/>
+          <w:b w:val="0"/>
+          <w:color w:val="231F20"/>
+          <w:kern w:val="0"/>
+          <w:sz w:val="24"/>
+          <w:szCs w:val="24"/>
+          <w:lang w:val="vi-VN" w:eastAsia="en-US" w:bidi="ar-SA"/>
+        </w:rPr>
+        <w:t>{{ backup_phone_2_line }}</w:t>
       </w:r>
       <w:r>
         <w:rPr>
           <w:rFonts w:eastAsia="Calibri" w:cs="Calibri" w:ascii="Times New Roman" w:hAnsi="Times New Roman"/>
-          <w:b w:val="0"/>
-          <w:color w:val="231F20"/>
-          <w:kern w:val="0"/>
-          <w:sz w:val="24"/>
-          <w:szCs w:val="24"/>
-          <w:lang w:val="vi-VN" w:eastAsia="en-US" w:bidi="ar-SA"/>
-        </w:rPr>
-        <w:t xml:space="preserve"> .....</w:t>
-      </w:r>
-      <w:r>
-        <w:rPr>
-          <w:rFonts w:eastAsia="Calibri" w:cs="Calibri" w:ascii="Times New Roman" w:hAnsi="Times New Roman"/>
-          <w:b w:val="0"/>
-          <w:color w:val="231F20"/>
-          <w:kern w:val="0"/>
-          <w:sz w:val="24"/>
-          <w:szCs w:val="24"/>
-          <w:lang w:val="vi-VN" w:eastAsia="en-US" w:bidi="ar-SA"/>
-        </w:rPr>
-        <w:t xml:space="preserve"> hoặc số điện thoại 2: </w:t>
-      </w:r>
-      <w:r>
-        <w:rPr>
-          <w:rFonts w:eastAsia="Calibri" w:cs="Calibri" w:ascii="Times New Roman" w:hAnsi="Times New Roman"/>
-          <w:b/>
-          <w:color w:val="231F20"/>
-          <w:kern w:val="0"/>
-          <w:sz w:val="26"/>
-          <w:szCs w:val="24"/>
-          <w:lang w:val="vi-VN" w:eastAsia="en-US" w:bidi="ar-SA"/>
-        </w:rPr>
-        <w:t>{{ backup_phone_2_line }}</w:t>
-      </w:r>
-      <w:r>
-        <w:rPr>
-          <w:rFonts w:eastAsia="Calibri" w:cs="Calibri" w:ascii="Times New Roman" w:hAnsi="Times New Roman"/>
-          <w:b w:val="0"/>
-          <w:color w:val="231F20"/>
-          <w:kern w:val="0"/>
-          <w:sz w:val="24"/>
-          <w:szCs w:val="24"/>
-          <w:lang w:val="vi-VN" w:eastAsia="en-US" w:bidi="ar-SA"/>
-        </w:rPr>
-        <w:t xml:space="preserve"> .....</w:t>
-      </w:r>
-      <w:r>
-        <w:rPr>
-          <w:rFonts w:eastAsia="Calibri" w:cs="Calibri" w:ascii="Times New Roman" w:hAnsi="Times New Roman"/>
-          <w:b w:val="0"/>
+          <w:b w:val="false"/>
           <w:color w:val="231F20"/>
           <w:kern w:val="0"/>
           <w:sz w:val="24"/>
@@ -4662,7 +4340,7 @@
         <w:sectPr>
           <w:type w:val="continuous"/>
           <w:pgSz w:w="11906" w:h="16838"/>
-          <w:pgMar w:left="708" w:right="708" w:gutter="0" w:header="0" w:top="580" w:footer="0" w:bottom="0"/>
+          <w:pgMar w:left="708" w:right="708" w:gutter="0" w:header="0" w:top="580" w:footer="0" w:bottom="57"/>
           <w:formProt w:val="false"/>
           <w:textDirection w:val="lrTb"/>
           <w:docGrid w:type="default" w:linePitch="600" w:charSpace="36864"/>
@@ -4689,7 +4367,9 @@
         <w:gridCol w:w="3497"/>
       </w:tblGrid>
       <w:tr>
-        <w:trPr/>
+        <w:trPr>
+          <w:trHeight w:val="631" w:hRule="atLeast"/>
+        </w:trPr>
         <w:tc>
           <w:tcPr>
             <w:tcW w:w="3497" w:type="dxa"/>
@@ -4828,7 +4508,7 @@
       </w:tr>
       <w:tr>
         <w:trPr>
-          <w:trHeight w:val="1814" w:hRule="exact"/>
+          <w:trHeight w:val="1385" w:hRule="exact"/>
         </w:trPr>
         <w:tc>
           <w:tcPr>
@@ -4842,13 +4522,14 @@
           </w:tcPr>
           <w:p>
             <w:pPr>
+              <w:pStyle w:val="Normal"/>
               <w:jc w:val="center"/>
+              <w:rPr/>
             </w:pPr>
-            <w:r/>
             <w:r>
               <w:rPr>
-                <w:rFonts w:ascii="Great Vibes" w:hAnsi="Great Vibes" w:eastAsia="Great Vibes" w:cs="Great Vibes"/>
-                <w:b w:val="0"/>
+                <w:rFonts w:eastAsia="Great Vibes" w:cs="Great Vibes" w:ascii="Great Vibes" w:hAnsi="Great Vibes"/>
+                <w:b w:val="false"/>
                 <w:sz w:val="36"/>
               </w:rPr>
               <w:t>{{ aftersale_requester_signature_given_name }}</w:t>
@@ -4867,13 +4548,14 @@
           </w:tcPr>
           <w:p>
             <w:pPr>
+              <w:pStyle w:val="Normal"/>
               <w:jc w:val="center"/>
+              <w:rPr/>
             </w:pPr>
-            <w:r/>
             <w:r>
               <w:rPr>
-                <w:rFonts w:ascii="Great Vibes" w:hAnsi="Great Vibes" w:eastAsia="Great Vibes" w:cs="Great Vibes"/>
-                <w:b w:val="0"/>
+                <w:rFonts w:eastAsia="Great Vibes" w:cs="Great Vibes" w:ascii="Great Vibes" w:hAnsi="Great Vibes"/>
+                <w:b w:val="false"/>
                 <w:sz w:val="36"/>
               </w:rPr>
               <w:t>{{ aftersale_new_owner_signature_given_name }}</w:t>
@@ -4892,13 +4574,14 @@
           </w:tcPr>
           <w:p>
             <w:pPr>
+              <w:pStyle w:val="Normal"/>
               <w:jc w:val="center"/>
+              <w:rPr/>
             </w:pPr>
-            <w:r/>
             <w:r>
               <w:rPr>
-                <w:rFonts w:ascii="Great Vibes" w:hAnsi="Great Vibes" w:eastAsia="Great Vibes" w:cs="Great Vibes"/>
-                <w:b w:val="0"/>
+                <w:rFonts w:eastAsia="Great Vibes" w:cs="Great Vibes" w:ascii="Great Vibes" w:hAnsi="Great Vibes"/>
+                <w:b w:val="false"/>
                 <w:sz w:val="36"/>
               </w:rPr>
               <w:t>{{ aftersale_clerk_signature_given_name }}</w:t>
@@ -4927,8 +4610,8 @@
             </w:pPr>
             <w:r>
               <w:rPr>
-                <w:rFonts w:ascii="Great Vibes" w:hAnsi="Great Vibes" w:eastAsia="Great Vibes" w:cs="Great Vibes"/>
-                <w:b w:val="0"/>
+                <w:rFonts w:eastAsia="Great Vibes" w:cs="Great Vibes" w:ascii="Great Vibes" w:hAnsi="Great Vibes"/>
+                <w:b w:val="false"/>
                 <w:i w:val="false"/>
                 <w:sz w:val="36"/>
                 <w:szCs w:val="24"/>
@@ -4956,8 +4639,8 @@
             </w:pPr>
             <w:r>
               <w:rPr>
-                <w:rFonts w:ascii="Great Vibes" w:hAnsi="Great Vibes" w:eastAsia="Great Vibes" w:cs="Great Vibes"/>
-                <w:b w:val="0"/>
+                <w:rFonts w:eastAsia="Great Vibes" w:cs="Great Vibes" w:ascii="Great Vibes" w:hAnsi="Great Vibes"/>
+                <w:b w:val="false"/>
                 <w:i w:val="false"/>
                 <w:sz w:val="36"/>
                 <w:szCs w:val="24"/>
@@ -4985,8 +4668,8 @@
             </w:pPr>
             <w:r>
               <w:rPr>
-                <w:rFonts w:ascii="Great Vibes" w:hAnsi="Great Vibes" w:eastAsia="Great Vibes" w:cs="Great Vibes"/>
-                <w:b w:val="0"/>
+                <w:rFonts w:eastAsia="Great Vibes" w:cs="Great Vibes" w:ascii="Great Vibes" w:hAnsi="Great Vibes"/>
+                <w:b w:val="false"/>
                 <w:i w:val="false"/>
                 <w:sz w:val="36"/>
                 <w:szCs w:val="24"/>
@@ -5000,7 +4683,7 @@
     <w:sectPr>
       <w:type w:val="continuous"/>
       <w:pgSz w:w="11906" w:h="16838"/>
-      <w:pgMar w:left="708" w:right="708" w:gutter="0" w:header="0" w:top="580" w:footer="0" w:bottom="0"/>
+      <w:pgMar w:left="708" w:right="708" w:gutter="0" w:header="0" w:top="580" w:footer="0" w:bottom="57"/>
       <w:formProt w:val="false"/>
       <w:textDirection w:val="lrTb"/>
       <w:docGrid w:type="default" w:linePitch="600" w:charSpace="36864"/>
@@ -5010,21 +4693,85 @@
 </file>
 
 <file path=word/footer1.xml><?xml version="1.0" encoding="utf-8"?>
-<w:ftr xmlns:m="http://schemas.openxmlformats.org/officeDocument/2006/math" xmlns:mc="http://schemas.openxmlformats.org/markup-compatibility/2006" xmlns:mo="http://schemas.microsoft.com/office/mac/office/2008/main" xmlns:mv="urn:schemas-microsoft-com:mac:vml" xmlns:o="urn:schemas-microsoft-com:office:office" xmlns:r="http://schemas.openxmlformats.org/officeDocument/2006/relationships" xmlns:v="urn:schemas-microsoft-com:vml" xmlns:w10="urn:schemas-microsoft-com:office:word" xmlns:w14="http://schemas.microsoft.com/office/word/2010/wordml" xmlns:w="http://schemas.openxmlformats.org/wordprocessingml/2006/main" xmlns:wne="http://schemas.microsoft.com/office/word/2006/wordml" xmlns:wp14="http://schemas.microsoft.com/office/word/2010/wordprocessingDrawing" xmlns:wp="http://schemas.openxmlformats.org/drawingml/2006/wordprocessingDrawing" xmlns:wpc="http://schemas.microsoft.com/office/word/2010/wordprocessingCanvas" xmlns:wpg="http://schemas.microsoft.com/office/word/2010/wordprocessingGroup" xmlns:wpi="http://schemas.microsoft.com/office/word/2010/wordprocessingInk" xmlns:wps="http://schemas.microsoft.com/office/word/2010/wordprocessingShape" mc:Ignorable="w14 wp14">
+<w:ftr xmlns:o="urn:schemas-microsoft-com:office:office" xmlns:r="http://schemas.openxmlformats.org/officeDocument/2006/relationships" xmlns:v="urn:schemas-microsoft-com:vml" xmlns:w="http://schemas.openxmlformats.org/wordprocessingml/2006/main" xmlns:w10="urn:schemas-microsoft-com:office:word" xmlns:wp="http://schemas.openxmlformats.org/drawingml/2006/wordprocessingDrawing" xmlns:pic="http://schemas.openxmlformats.org/drawingml/2006/picture" xmlns:wps="http://schemas.microsoft.com/office/word/2010/wordprocessingShape" xmlns:wpg="http://schemas.microsoft.com/office/word/2010/wordprocessingGroup" xmlns:mc="http://schemas.openxmlformats.org/markup-compatibility/2006" xmlns:wp14="http://schemas.microsoft.com/office/word/2010/wordprocessingDrawing" xmlns:w14="http://schemas.microsoft.com/office/word/2010/wordml" xmlns:w15="http://schemas.microsoft.com/office/word/2012/wordml" mc:Ignorable="w14 wp14 w15">
   <w:p>
     <w:pPr>
       <w:pStyle w:val="Footer"/>
+      <w:rPr/>
     </w:pPr>
+    <w:r>
+      <w:rPr/>
+    </w:r>
+  </w:p>
+</w:ftr>
+</file>
+
+<file path=word/footer2.xml><?xml version="1.0" encoding="utf-8"?>
+<w:ftr xmlns:o="urn:schemas-microsoft-com:office:office" xmlns:r="http://schemas.openxmlformats.org/officeDocument/2006/relationships" xmlns:v="urn:schemas-microsoft-com:vml" xmlns:w="http://schemas.openxmlformats.org/wordprocessingml/2006/main" xmlns:w10="urn:schemas-microsoft-com:office:word" xmlns:wp="http://schemas.openxmlformats.org/drawingml/2006/wordprocessingDrawing" xmlns:pic="http://schemas.openxmlformats.org/drawingml/2006/picture" xmlns:wps="http://schemas.microsoft.com/office/word/2010/wordprocessingShape" xmlns:wpg="http://schemas.microsoft.com/office/word/2010/wordprocessingGroup" xmlns:mc="http://schemas.openxmlformats.org/markup-compatibility/2006" xmlns:wp14="http://schemas.microsoft.com/office/word/2010/wordprocessingDrawing" xmlns:w14="http://schemas.microsoft.com/office/word/2010/wordml" xmlns:w15="http://schemas.microsoft.com/office/word/2012/wordml" mc:Ignorable="w14 wp14 w15">
+  <w:p>
+    <w:pPr>
+      <w:pStyle w:val="Footer"/>
+      <w:rPr/>
+    </w:pPr>
+    <w:r>
+      <w:rPr/>
+    </w:r>
+  </w:p>
+</w:ftr>
+</file>
+
+<file path=word/footer3.xml><?xml version="1.0" encoding="utf-8"?>
+<w:ftr xmlns:o="urn:schemas-microsoft-com:office:office" xmlns:r="http://schemas.openxmlformats.org/officeDocument/2006/relationships" xmlns:v="urn:schemas-microsoft-com:vml" xmlns:w="http://schemas.openxmlformats.org/wordprocessingml/2006/main" xmlns:w10="urn:schemas-microsoft-com:office:word" xmlns:wp="http://schemas.openxmlformats.org/drawingml/2006/wordprocessingDrawing" xmlns:pic="http://schemas.openxmlformats.org/drawingml/2006/picture" xmlns:wps="http://schemas.microsoft.com/office/word/2010/wordprocessingShape" xmlns:wpg="http://schemas.microsoft.com/office/word/2010/wordprocessingGroup" xmlns:mc="http://schemas.openxmlformats.org/markup-compatibility/2006" xmlns:wp14="http://schemas.microsoft.com/office/word/2010/wordprocessingDrawing" xmlns:w14="http://schemas.microsoft.com/office/word/2010/wordml" xmlns:w15="http://schemas.microsoft.com/office/word/2012/wordml" mc:Ignorable="w14 wp14 w15">
+  <w:p>
+    <w:pPr>
+      <w:pStyle w:val="Footer"/>
+      <w:rPr/>
+    </w:pPr>
+    <w:r>
+      <w:rPr/>
+    </w:r>
   </w:p>
 </w:ftr>
 </file>
 
 <file path=word/header1.xml><?xml version="1.0" encoding="utf-8"?>
-<w:hdr xmlns:m="http://schemas.openxmlformats.org/officeDocument/2006/math" xmlns:mc="http://schemas.openxmlformats.org/markup-compatibility/2006" xmlns:mo="http://schemas.microsoft.com/office/mac/office/2008/main" xmlns:mv="urn:schemas-microsoft-com:mac:vml" xmlns:o="urn:schemas-microsoft-com:office:office" xmlns:r="http://schemas.openxmlformats.org/officeDocument/2006/relationships" xmlns:v="urn:schemas-microsoft-com:vml" xmlns:w10="urn:schemas-microsoft-com:office:word" xmlns:w14="http://schemas.microsoft.com/office/word/2010/wordml" xmlns:w="http://schemas.openxmlformats.org/wordprocessingml/2006/main" xmlns:wne="http://schemas.microsoft.com/office/word/2006/wordml" xmlns:wp14="http://schemas.microsoft.com/office/word/2010/wordprocessingDrawing" xmlns:wp="http://schemas.openxmlformats.org/drawingml/2006/wordprocessingDrawing" xmlns:wpc="http://schemas.microsoft.com/office/word/2010/wordprocessingCanvas" xmlns:wpg="http://schemas.microsoft.com/office/word/2010/wordprocessingGroup" xmlns:wpi="http://schemas.microsoft.com/office/word/2010/wordprocessingInk" xmlns:wps="http://schemas.microsoft.com/office/word/2010/wordprocessingShape" mc:Ignorable="w14 wp14">
+<w:hdr xmlns:o="urn:schemas-microsoft-com:office:office" xmlns:r="http://schemas.openxmlformats.org/officeDocument/2006/relationships" xmlns:v="urn:schemas-microsoft-com:vml" xmlns:w="http://schemas.openxmlformats.org/wordprocessingml/2006/main" xmlns:w10="urn:schemas-microsoft-com:office:word" xmlns:wp="http://schemas.openxmlformats.org/drawingml/2006/wordprocessingDrawing" xmlns:pic="http://schemas.openxmlformats.org/drawingml/2006/picture" xmlns:wps="http://schemas.microsoft.com/office/word/2010/wordprocessingShape" xmlns:wpg="http://schemas.microsoft.com/office/word/2010/wordprocessingGroup" xmlns:mc="http://schemas.openxmlformats.org/markup-compatibility/2006" xmlns:wp14="http://schemas.microsoft.com/office/word/2010/wordprocessingDrawing" xmlns:w14="http://schemas.microsoft.com/office/word/2010/wordml" xmlns:w15="http://schemas.microsoft.com/office/word/2012/wordml" mc:Ignorable="w14 wp14 w15">
   <w:p>
     <w:pPr>
       <w:pStyle w:val="Header"/>
+      <w:rPr/>
     </w:pPr>
+    <w:r>
+      <w:rPr/>
+    </w:r>
+  </w:p>
+</w:hdr>
+</file>
+
+<file path=word/header2.xml><?xml version="1.0" encoding="utf-8"?>
+<w:hdr xmlns:o="urn:schemas-microsoft-com:office:office" xmlns:r="http://schemas.openxmlformats.org/officeDocument/2006/relationships" xmlns:v="urn:schemas-microsoft-com:vml" xmlns:w="http://schemas.openxmlformats.org/wordprocessingml/2006/main" xmlns:w10="urn:schemas-microsoft-com:office:word" xmlns:wp="http://schemas.openxmlformats.org/drawingml/2006/wordprocessingDrawing" xmlns:pic="http://schemas.openxmlformats.org/drawingml/2006/picture" xmlns:wps="http://schemas.microsoft.com/office/word/2010/wordprocessingShape" xmlns:wpg="http://schemas.microsoft.com/office/word/2010/wordprocessingGroup" xmlns:mc="http://schemas.openxmlformats.org/markup-compatibility/2006" xmlns:wp14="http://schemas.microsoft.com/office/word/2010/wordprocessingDrawing" xmlns:w14="http://schemas.microsoft.com/office/word/2010/wordml" xmlns:w15="http://schemas.microsoft.com/office/word/2012/wordml" mc:Ignorable="w14 wp14 w15">
+  <w:p>
+    <w:pPr>
+      <w:pStyle w:val="Header"/>
+      <w:rPr/>
+    </w:pPr>
+    <w:r>
+      <w:rPr/>
+    </w:r>
+  </w:p>
+</w:hdr>
+</file>
+
+<file path=word/header3.xml><?xml version="1.0" encoding="utf-8"?>
+<w:hdr xmlns:o="urn:schemas-microsoft-com:office:office" xmlns:r="http://schemas.openxmlformats.org/officeDocument/2006/relationships" xmlns:v="urn:schemas-microsoft-com:vml" xmlns:w="http://schemas.openxmlformats.org/wordprocessingml/2006/main" xmlns:w10="urn:schemas-microsoft-com:office:word" xmlns:wp="http://schemas.openxmlformats.org/drawingml/2006/wordprocessingDrawing" xmlns:pic="http://schemas.openxmlformats.org/drawingml/2006/picture" xmlns:wps="http://schemas.microsoft.com/office/word/2010/wordprocessingShape" xmlns:wpg="http://schemas.microsoft.com/office/word/2010/wordprocessingGroup" xmlns:mc="http://schemas.openxmlformats.org/markup-compatibility/2006" xmlns:wp14="http://schemas.microsoft.com/office/word/2010/wordprocessingDrawing" xmlns:w14="http://schemas.microsoft.com/office/word/2010/wordml" xmlns:w15="http://schemas.microsoft.com/office/word/2012/wordml" mc:Ignorable="w14 wp14 w15">
+  <w:p>
+    <w:pPr>
+      <w:pStyle w:val="Header"/>
+      <w:rPr/>
+    </w:pPr>
+    <w:r>
+      <w:rPr/>
+    </w:r>
   </w:p>
 </w:hdr>
 </file>
@@ -6103,6 +5850,25 @@
     <w:pPr/>
     <w:rPr/>
   </w:style>
+  <w:style w:type="paragraph" w:styleId="HeaderandFooter">
+    <w:name w:val="Header and Footer"/>
+    <w:basedOn w:val="Normal"/>
+    <w:qFormat/>
+    <w:pPr/>
+    <w:rPr/>
+  </w:style>
+  <w:style w:type="paragraph" w:styleId="Header">
+    <w:name w:val="header"/>
+    <w:basedOn w:val="HeaderandFooter"/>
+    <w:pPr/>
+    <w:rPr/>
+  </w:style>
+  <w:style w:type="paragraph" w:styleId="Footer">
+    <w:name w:val="footer"/>
+    <w:basedOn w:val="HeaderandFooter"/>
+    <w:pPr/>
+    <w:rPr/>
+  </w:style>
   <w:style w:type="numbering" w:styleId="NoList" w:default="1">
     <w:name w:val="No List"/>
     <w:uiPriority w:val="99"/>

</xml_diff>